<commit_message>
Ajusta informe de Adrián a la hoja oficial y simplifica la tabla de clasificación
Co-Authored-By: Claude Opus 5.5 <noreply@anthropic.com>
Claude-Session: https://claude.ai/code/session_01XoDZLsg3S6BNvJBdoo6Rq7
</commit_message>
<xml_diff>
--- a/informes/Informe_entrevista_Adrian_Villacres.docx
+++ b/informes/Informe_entrevista_Adrian_Villacres.docx
@@ -404,7 +404,7 @@
                 <w:sz w:val="19"/>
                 <w:szCs w:val="19"/>
               </w:rPr>
-              <w:t xml:space="preserve">adrian_villacres2002@hotmail.com</w:t>
+              <w:t xml:space="preserve">jhovilla@pichincha.com</w:t>
             </w:r>
           </w:p>
         </w:tc>
@@ -503,7 +503,7 @@
               <w:rPr>
                 <w:rFonts w:ascii="Roboto Slab" w:eastAsia="Roboto Slab" w:hAnsi="Roboto Slab" w:cs="Roboto Slab"/>
               </w:rPr>
-              <w:t xml:space="preserve">+593 98 698 7431</w:t>
+              <w:t xml:space="preserve">No registrado</w:t>
             </w:r>
           </w:p>
         </w:tc>
@@ -800,7 +800,7 @@
               <w:rPr>
                 <w:rFonts w:ascii="Roboto Slab" w:eastAsia="Roboto Slab" w:hAnsi="Roboto Slab" w:cs="Roboto Slab"/>
               </w:rPr>
-              <w:t xml:space="preserve">Leonardo</w:t>
+              <w:t xml:space="preserve">MS, SM, LA</w:t>
             </w:r>
           </w:p>
         </w:tc>
@@ -899,7 +899,7 @@
               <w:rPr>
                 <w:rFonts w:ascii="Roboto Slab" w:eastAsia="Roboto Slab" w:hAnsi="Roboto Slab" w:cs="Roboto Slab"/>
               </w:rPr>
-              <w:t xml:space="preserve">Leonardo</w:t>
+              <w:t xml:space="preserve">MS, SM, LA</w:t>
             </w:r>
           </w:p>
         </w:tc>
@@ -983,8 +983,11 @@
             <w:r>
               <w:rPr>
                 <w:rFonts w:ascii="Roboto Slab" w:eastAsia="Roboto Slab" w:hAnsi="Roboto Slab" w:cs="Roboto Slab"/>
-              </w:rPr>
-              <w:t xml:space="preserve">Por definir</w:t>
+                <w:b/>
+                <w:bCs/>
+                <w:color w:val="C00000"/>
+              </w:rPr>
+              <w:t xml:space="preserve">NO</w:t>
             </w:r>
           </w:p>
         </w:tc>
@@ -1013,9 +1016,9 @@
         <w:tblLayout w:type="fixed"/>
       </w:tblPr>
       <w:tblGrid>
-        <w:gridCol w:w="900"/>
-        <w:gridCol w:w="900"/>
-        <w:gridCol w:w="3600"/>
+        <w:gridCol w:w="1000"/>
+        <w:gridCol w:w="1000"/>
+        <w:gridCol w:w="3400"/>
       </w:tblGrid>
       <w:tr>
         <w:tc>
@@ -1027,7 +1030,7 @@
           </w:tcPr>
           <w:p>
             <w:pPr>
-              <w:spacing w:before="10" w:after="10" w:line="240" w:lineRule="auto"/>
+              <w:spacing w:before="30" w:after="30" w:line="240" w:lineRule="auto"/>
               <w:jc w:val="center"/>
             </w:pPr>
             <w:r>
@@ -1036,8 +1039,8 @@
                 <w:b/>
                 <w:bCs/>
                 <w:color w:val="C55A11"/>
-                <w:sz w:val="17"/>
-                <w:szCs w:val="17"/>
+                <w:sz w:val="19"/>
+                <w:szCs w:val="19"/>
               </w:rPr>
               <w:t xml:space="preserve">Tabla de clasificación</w:t>
             </w:r>
@@ -1047,13 +1050,13 @@
       <w:tr>
         <w:tc>
           <w:tcPr>
-            <w:tcW w:w="900" w:type="dxa"/>
+            <w:tcW w:w="1000" w:type="dxa"/>
             <w:shd w:val="clear" w:color="auto" w:fill="D9D9D9"/>
             <w:vAlign w:val="center"/>
           </w:tcPr>
           <w:p>
             <w:pPr>
-              <w:spacing w:before="10" w:after="10" w:line="240" w:lineRule="auto"/>
+              <w:spacing w:before="30" w:after="30" w:line="240" w:lineRule="auto"/>
               <w:jc w:val="center"/>
             </w:pPr>
             <w:r>
@@ -1062,8 +1065,8 @@
                 <w:b/>
                 <w:bCs/>
                 <w:color w:val="000000"/>
-                <w:sz w:val="17"/>
-                <w:szCs w:val="17"/>
+                <w:sz w:val="19"/>
+                <w:szCs w:val="19"/>
               </w:rPr>
               <w:t xml:space="preserve">Desde (≥)</w:t>
             </w:r>
@@ -1071,13 +1074,13 @@
         </w:tc>
         <w:tc>
           <w:tcPr>
-            <w:tcW w:w="900" w:type="dxa"/>
+            <w:tcW w:w="1000" w:type="dxa"/>
             <w:shd w:val="clear" w:color="auto" w:fill="D9D9D9"/>
             <w:vAlign w:val="center"/>
           </w:tcPr>
           <w:p>
             <w:pPr>
-              <w:spacing w:before="10" w:after="10" w:line="240" w:lineRule="auto"/>
+              <w:spacing w:before="30" w:after="30" w:line="240" w:lineRule="auto"/>
               <w:jc w:val="center"/>
             </w:pPr>
             <w:r>
@@ -1086,8 +1089,8 @@
                 <w:b/>
                 <w:bCs/>
                 <w:color w:val="000000"/>
-                <w:sz w:val="17"/>
-                <w:szCs w:val="17"/>
+                <w:sz w:val="19"/>
+                <w:szCs w:val="19"/>
               </w:rPr>
               <w:t xml:space="preserve">Hasta (&lt;)</w:t>
             </w:r>
@@ -1095,13 +1098,13 @@
         </w:tc>
         <w:tc>
           <w:tcPr>
-            <w:tcW w:w="3600" w:type="dxa"/>
+            <w:tcW w:w="3400" w:type="dxa"/>
             <w:shd w:val="clear" w:color="auto" w:fill="D9D9D9"/>
             <w:vAlign w:val="center"/>
           </w:tcPr>
           <w:p>
             <w:pPr>
-              <w:spacing w:before="10" w:after="10" w:line="240" w:lineRule="auto"/>
+              <w:spacing w:before="30" w:after="30" w:line="240" w:lineRule="auto"/>
               <w:jc w:val="center"/>
             </w:pPr>
             <w:r>
@@ -1110,8 +1113,8 @@
                 <w:b/>
                 <w:bCs/>
                 <w:color w:val="000000"/>
-                <w:sz w:val="17"/>
-                <w:szCs w:val="17"/>
+                <w:sz w:val="19"/>
+                <w:szCs w:val="19"/>
               </w:rPr>
               <w:t xml:space="preserve">Clasificación</w:t>
             </w:r>
@@ -1121,13 +1124,13 @@
       <w:tr>
         <w:tc>
           <w:tcPr>
-            <w:tcW w:w="900" w:type="dxa"/>
+            <w:tcW w:w="1000" w:type="dxa"/>
             <w:shd w:val="clear" w:color="auto" w:fill="FFC7CE"/>
             <w:vAlign w:val="center"/>
           </w:tcPr>
           <w:p>
             <w:pPr>
-              <w:spacing w:before="10" w:after="10" w:line="240" w:lineRule="auto"/>
+              <w:spacing w:before="30" w:after="30" w:line="240" w:lineRule="auto"/>
               <w:jc w:val="center"/>
             </w:pPr>
             <w:r>
@@ -1136,8 +1139,8 @@
                 <w:b/>
                 <w:bCs/>
                 <w:color w:val="9C0006"/>
-                <w:sz w:val="17"/>
-                <w:szCs w:val="17"/>
+                <w:sz w:val="19"/>
+                <w:szCs w:val="19"/>
               </w:rPr>
               <w:t xml:space="preserve">0</w:t>
             </w:r>
@@ -1145,13 +1148,13 @@
         </w:tc>
         <w:tc>
           <w:tcPr>
-            <w:tcW w:w="900" w:type="dxa"/>
+            <w:tcW w:w="1000" w:type="dxa"/>
             <w:shd w:val="clear" w:color="auto" w:fill="FFC7CE"/>
             <w:vAlign w:val="center"/>
           </w:tcPr>
           <w:p>
             <w:pPr>
-              <w:spacing w:before="10" w:after="10" w:line="240" w:lineRule="auto"/>
+              <w:spacing w:before="30" w:after="30" w:line="240" w:lineRule="auto"/>
               <w:jc w:val="center"/>
             </w:pPr>
             <w:r>
@@ -1160,8 +1163,8 @@
                 <w:b/>
                 <w:bCs/>
                 <w:color w:val="9C0006"/>
-                <w:sz w:val="17"/>
-                <w:szCs w:val="17"/>
+                <w:sz w:val="19"/>
+                <w:szCs w:val="19"/>
               </w:rPr>
               <w:t xml:space="preserve">50</w:t>
             </w:r>
@@ -1169,13 +1172,13 @@
         </w:tc>
         <w:tc>
           <w:tcPr>
-            <w:tcW w:w="3600" w:type="dxa"/>
+            <w:tcW w:w="3400" w:type="dxa"/>
             <w:shd w:val="clear" w:color="auto" w:fill="FFC7CE"/>
             <w:vAlign w:val="center"/>
           </w:tcPr>
           <w:p>
             <w:pPr>
-              <w:spacing w:before="10" w:after="10" w:line="240" w:lineRule="auto"/>
+              <w:spacing w:before="30" w:after="30" w:line="240" w:lineRule="auto"/>
               <w:jc w:val="center"/>
             </w:pPr>
             <w:r>
@@ -1184,10 +1187,10 @@
                 <w:b/>
                 <w:bCs/>
                 <w:color w:val="9C0006"/>
-                <w:sz w:val="17"/>
-                <w:szCs w:val="17"/>
-              </w:rPr>
-              <w:t xml:space="preserve">NO APROBADO</w:t>
+                <w:sz w:val="19"/>
+                <w:szCs w:val="19"/>
+              </w:rPr>
+              <w:t xml:space="preserve">No aprobado</w:t>
             </w:r>
           </w:p>
         </w:tc>
@@ -1195,13 +1198,13 @@
       <w:tr>
         <w:tc>
           <w:tcPr>
-            <w:tcW w:w="900" w:type="dxa"/>
-            <w:shd w:val="clear" w:color="auto" w:fill="FCE4D6"/>
-            <w:vAlign w:val="center"/>
-          </w:tcPr>
-          <w:p>
-            <w:pPr>
-              <w:spacing w:before="10" w:after="10" w:line="240" w:lineRule="auto"/>
+            <w:tcW w:w="1000" w:type="dxa"/>
+            <w:shd w:val="clear" w:color="auto" w:fill="FFEB9C"/>
+            <w:vAlign w:val="center"/>
+          </w:tcPr>
+          <w:p>
+            <w:pPr>
+              <w:spacing w:before="30" w:after="30" w:line="240" w:lineRule="auto"/>
               <w:jc w:val="center"/>
             </w:pPr>
             <w:r>
@@ -1209,9 +1212,9 @@
                 <w:rFonts w:ascii="Roboto Slab" w:eastAsia="Roboto Slab" w:hAnsi="Roboto Slab" w:cs="Roboto Slab"/>
                 <w:b/>
                 <w:bCs/>
-                <w:color w:val="843C0C"/>
-                <w:sz w:val="17"/>
-                <w:szCs w:val="17"/>
+                <w:color w:val="7F6000"/>
+                <w:sz w:val="19"/>
+                <w:szCs w:val="19"/>
               </w:rPr>
               <w:t xml:space="preserve">50</w:t>
             </w:r>
@@ -1219,13 +1222,13 @@
         </w:tc>
         <w:tc>
           <w:tcPr>
-            <w:tcW w:w="900" w:type="dxa"/>
-            <w:shd w:val="clear" w:color="auto" w:fill="FCE4D6"/>
-            <w:vAlign w:val="center"/>
-          </w:tcPr>
-          <w:p>
-            <w:pPr>
-              <w:spacing w:before="10" w:after="10" w:line="240" w:lineRule="auto"/>
+            <w:tcW w:w="1000" w:type="dxa"/>
+            <w:shd w:val="clear" w:color="auto" w:fill="FFEB9C"/>
+            <w:vAlign w:val="center"/>
+          </w:tcPr>
+          <w:p>
+            <w:pPr>
+              <w:spacing w:before="30" w:after="30" w:line="240" w:lineRule="auto"/>
               <w:jc w:val="center"/>
             </w:pPr>
             <w:r>
@@ -1233,23 +1236,23 @@
                 <w:rFonts w:ascii="Roboto Slab" w:eastAsia="Roboto Slab" w:hAnsi="Roboto Slab" w:cs="Roboto Slab"/>
                 <w:b/>
                 <w:bCs/>
-                <w:color w:val="843C0C"/>
-                <w:sz w:val="17"/>
-                <w:szCs w:val="17"/>
-              </w:rPr>
-              <w:t xml:space="preserve">55</w:t>
-            </w:r>
-          </w:p>
-        </w:tc>
-        <w:tc>
-          <w:tcPr>
-            <w:tcW w:w="3600" w:type="dxa"/>
-            <w:shd w:val="clear" w:color="auto" w:fill="FCE4D6"/>
-            <w:vAlign w:val="center"/>
-          </w:tcPr>
-          <w:p>
-            <w:pPr>
-              <w:spacing w:before="10" w:after="10" w:line="240" w:lineRule="auto"/>
+                <w:color w:val="7F6000"/>
+                <w:sz w:val="19"/>
+                <w:szCs w:val="19"/>
+              </w:rPr>
+              <w:t xml:space="preserve">70</w:t>
+            </w:r>
+          </w:p>
+        </w:tc>
+        <w:tc>
+          <w:tcPr>
+            <w:tcW w:w="3400" w:type="dxa"/>
+            <w:shd w:val="clear" w:color="auto" w:fill="FFEB9C"/>
+            <w:vAlign w:val="center"/>
+          </w:tcPr>
+          <w:p>
+            <w:pPr>
+              <w:spacing w:before="30" w:after="30" w:line="240" w:lineRule="auto"/>
               <w:jc w:val="center"/>
             </w:pPr>
             <w:r>
@@ -1257,11 +1260,11 @@
                 <w:rFonts w:ascii="Roboto Slab" w:eastAsia="Roboto Slab" w:hAnsi="Roboto Slab" w:cs="Roboto Slab"/>
                 <w:b/>
                 <w:bCs/>
-                <w:color w:val="843C0C"/>
-                <w:sz w:val="17"/>
-                <w:szCs w:val="17"/>
-              </w:rPr>
-              <w:t xml:space="preserve">Especialista IA - Novato</w:t>
+                <w:color w:val="7F6000"/>
+                <w:sz w:val="19"/>
+                <w:szCs w:val="19"/>
+              </w:rPr>
+              <w:t xml:space="preserve">Especialista Software IA</w:t>
             </w:r>
           </w:p>
         </w:tc>
@@ -1269,13 +1272,13 @@
       <w:tr>
         <w:tc>
           <w:tcPr>
-            <w:tcW w:w="900" w:type="dxa"/>
-            <w:shd w:val="clear" w:color="auto" w:fill="FCE4D6"/>
-            <w:vAlign w:val="center"/>
-          </w:tcPr>
-          <w:p>
-            <w:pPr>
-              <w:spacing w:before="10" w:after="10" w:line="240" w:lineRule="auto"/>
+            <w:tcW w:w="1000" w:type="dxa"/>
+            <w:shd w:val="clear" w:color="auto" w:fill="E2EFDA"/>
+            <w:vAlign w:val="center"/>
+          </w:tcPr>
+          <w:p>
+            <w:pPr>
+              <w:spacing w:before="30" w:after="30" w:line="240" w:lineRule="auto"/>
               <w:jc w:val="center"/>
             </w:pPr>
             <w:r>
@@ -1283,23 +1286,23 @@
                 <w:rFonts w:ascii="Roboto Slab" w:eastAsia="Roboto Slab" w:hAnsi="Roboto Slab" w:cs="Roboto Slab"/>
                 <w:b/>
                 <w:bCs/>
-                <w:color w:val="843C0C"/>
-                <w:sz w:val="17"/>
-                <w:szCs w:val="17"/>
-              </w:rPr>
-              <w:t xml:space="preserve">55</w:t>
-            </w:r>
-          </w:p>
-        </w:tc>
-        <w:tc>
-          <w:tcPr>
-            <w:tcW w:w="900" w:type="dxa"/>
-            <w:shd w:val="clear" w:color="auto" w:fill="FCE4D6"/>
-            <w:vAlign w:val="center"/>
-          </w:tcPr>
-          <w:p>
-            <w:pPr>
-              <w:spacing w:before="10" w:after="10" w:line="240" w:lineRule="auto"/>
+                <w:color w:val="375623"/>
+                <w:sz w:val="19"/>
+                <w:szCs w:val="19"/>
+              </w:rPr>
+              <w:t xml:space="preserve">70</w:t>
+            </w:r>
+          </w:p>
+        </w:tc>
+        <w:tc>
+          <w:tcPr>
+            <w:tcW w:w="1000" w:type="dxa"/>
+            <w:shd w:val="clear" w:color="auto" w:fill="E2EFDA"/>
+            <w:vAlign w:val="center"/>
+          </w:tcPr>
+          <w:p>
+            <w:pPr>
+              <w:spacing w:before="30" w:after="30" w:line="240" w:lineRule="auto"/>
               <w:jc w:val="center"/>
             </w:pPr>
             <w:r>
@@ -1307,23 +1310,23 @@
                 <w:rFonts w:ascii="Roboto Slab" w:eastAsia="Roboto Slab" w:hAnsi="Roboto Slab" w:cs="Roboto Slab"/>
                 <w:b/>
                 <w:bCs/>
-                <w:color w:val="843C0C"/>
-                <w:sz w:val="17"/>
-                <w:szCs w:val="17"/>
-              </w:rPr>
-              <w:t xml:space="preserve">60</w:t>
-            </w:r>
-          </w:p>
-        </w:tc>
-        <w:tc>
-          <w:tcPr>
-            <w:tcW w:w="3600" w:type="dxa"/>
-            <w:shd w:val="clear" w:color="auto" w:fill="FCE4D6"/>
-            <w:vAlign w:val="center"/>
-          </w:tcPr>
-          <w:p>
-            <w:pPr>
-              <w:spacing w:before="10" w:after="10" w:line="240" w:lineRule="auto"/>
+                <w:color w:val="375623"/>
+                <w:sz w:val="19"/>
+                <w:szCs w:val="19"/>
+              </w:rPr>
+              <w:t xml:space="preserve">85</w:t>
+            </w:r>
+          </w:p>
+        </w:tc>
+        <w:tc>
+          <w:tcPr>
+            <w:tcW w:w="3400" w:type="dxa"/>
+            <w:shd w:val="clear" w:color="auto" w:fill="E2EFDA"/>
+            <w:vAlign w:val="center"/>
+          </w:tcPr>
+          <w:p>
+            <w:pPr>
+              <w:spacing w:before="30" w:after="30" w:line="240" w:lineRule="auto"/>
               <w:jc w:val="center"/>
             </w:pPr>
             <w:r>
@@ -1331,11 +1334,11 @@
                 <w:rFonts w:ascii="Roboto Slab" w:eastAsia="Roboto Slab" w:hAnsi="Roboto Slab" w:cs="Roboto Slab"/>
                 <w:b/>
                 <w:bCs/>
-                <w:color w:val="843C0C"/>
-                <w:sz w:val="17"/>
-                <w:szCs w:val="17"/>
-              </w:rPr>
-              <w:t xml:space="preserve">Especialista IA - Principiante</w:t>
+                <w:color w:val="375623"/>
+                <w:sz w:val="19"/>
+                <w:szCs w:val="19"/>
+              </w:rPr>
+              <w:t xml:space="preserve">Ingeniero Software IA</w:t>
             </w:r>
           </w:p>
         </w:tc>
@@ -1343,605 +1346,13 @@
       <w:tr>
         <w:tc>
           <w:tcPr>
-            <w:tcW w:w="900" w:type="dxa"/>
-            <w:shd w:val="clear" w:color="auto" w:fill="FFF2CC"/>
-            <w:vAlign w:val="center"/>
-          </w:tcPr>
-          <w:p>
-            <w:pPr>
-              <w:spacing w:before="10" w:after="10" w:line="240" w:lineRule="auto"/>
-              <w:jc w:val="center"/>
-            </w:pPr>
-            <w:r>
-              <w:rPr>
-                <w:rFonts w:ascii="Roboto Slab" w:eastAsia="Roboto Slab" w:hAnsi="Roboto Slab" w:cs="Roboto Slab"/>
-                <w:b/>
-                <w:bCs/>
-                <w:color w:val="7F6000"/>
-                <w:sz w:val="17"/>
-                <w:szCs w:val="17"/>
-              </w:rPr>
-              <w:t xml:space="preserve">60</w:t>
-            </w:r>
-          </w:p>
-        </w:tc>
-        <w:tc>
-          <w:tcPr>
-            <w:tcW w:w="900" w:type="dxa"/>
-            <w:shd w:val="clear" w:color="auto" w:fill="FFF2CC"/>
-            <w:vAlign w:val="center"/>
-          </w:tcPr>
-          <w:p>
-            <w:pPr>
-              <w:spacing w:before="10" w:after="10" w:line="240" w:lineRule="auto"/>
-              <w:jc w:val="center"/>
-            </w:pPr>
-            <w:r>
-              <w:rPr>
-                <w:rFonts w:ascii="Roboto Slab" w:eastAsia="Roboto Slab" w:hAnsi="Roboto Slab" w:cs="Roboto Slab"/>
-                <w:b/>
-                <w:bCs/>
-                <w:color w:val="7F6000"/>
-                <w:sz w:val="17"/>
-                <w:szCs w:val="17"/>
-              </w:rPr>
-              <w:t xml:space="preserve">63</w:t>
-            </w:r>
-          </w:p>
-        </w:tc>
-        <w:tc>
-          <w:tcPr>
-            <w:tcW w:w="3600" w:type="dxa"/>
-            <w:shd w:val="clear" w:color="auto" w:fill="FFF2CC"/>
-            <w:vAlign w:val="center"/>
-          </w:tcPr>
-          <w:p>
-            <w:pPr>
-              <w:spacing w:before="10" w:after="10" w:line="240" w:lineRule="auto"/>
-              <w:jc w:val="center"/>
-            </w:pPr>
-            <w:r>
-              <w:rPr>
-                <w:rFonts w:ascii="Roboto Slab" w:eastAsia="Roboto Slab" w:hAnsi="Roboto Slab" w:cs="Roboto Slab"/>
-                <w:b/>
-                <w:bCs/>
-                <w:color w:val="7F6000"/>
-                <w:sz w:val="17"/>
-                <w:szCs w:val="17"/>
-              </w:rPr>
-              <w:t xml:space="preserve">Especialista IA - Competente</w:t>
-            </w:r>
-          </w:p>
-        </w:tc>
-      </w:tr>
-      <w:tr>
-        <w:tc>
-          <w:tcPr>
-            <w:tcW w:w="900" w:type="dxa"/>
-            <w:shd w:val="clear" w:color="auto" w:fill="FFF2CC"/>
-            <w:vAlign w:val="center"/>
-          </w:tcPr>
-          <w:p>
-            <w:pPr>
-              <w:spacing w:before="10" w:after="10" w:line="240" w:lineRule="auto"/>
-              <w:jc w:val="center"/>
-            </w:pPr>
-            <w:r>
-              <w:rPr>
-                <w:rFonts w:ascii="Roboto Slab" w:eastAsia="Roboto Slab" w:hAnsi="Roboto Slab" w:cs="Roboto Slab"/>
-                <w:b/>
-                <w:bCs/>
-                <w:color w:val="7F6000"/>
-                <w:sz w:val="17"/>
-                <w:szCs w:val="17"/>
-              </w:rPr>
-              <w:t xml:space="preserve">63</w:t>
-            </w:r>
-          </w:p>
-        </w:tc>
-        <w:tc>
-          <w:tcPr>
-            <w:tcW w:w="900" w:type="dxa"/>
-            <w:shd w:val="clear" w:color="auto" w:fill="FFF2CC"/>
-            <w:vAlign w:val="center"/>
-          </w:tcPr>
-          <w:p>
-            <w:pPr>
-              <w:spacing w:before="10" w:after="10" w:line="240" w:lineRule="auto"/>
-              <w:jc w:val="center"/>
-            </w:pPr>
-            <w:r>
-              <w:rPr>
-                <w:rFonts w:ascii="Roboto Slab" w:eastAsia="Roboto Slab" w:hAnsi="Roboto Slab" w:cs="Roboto Slab"/>
-                <w:b/>
-                <w:bCs/>
-                <w:color w:val="7F6000"/>
-                <w:sz w:val="17"/>
-                <w:szCs w:val="17"/>
-              </w:rPr>
-              <w:t xml:space="preserve">67</w:t>
-            </w:r>
-          </w:p>
-        </w:tc>
-        <w:tc>
-          <w:tcPr>
-            <w:tcW w:w="3600" w:type="dxa"/>
-            <w:shd w:val="clear" w:color="auto" w:fill="FFF2CC"/>
-            <w:vAlign w:val="center"/>
-          </w:tcPr>
-          <w:p>
-            <w:pPr>
-              <w:spacing w:before="10" w:after="10" w:line="240" w:lineRule="auto"/>
-              <w:jc w:val="center"/>
-            </w:pPr>
-            <w:r>
-              <w:rPr>
-                <w:rFonts w:ascii="Roboto Slab" w:eastAsia="Roboto Slab" w:hAnsi="Roboto Slab" w:cs="Roboto Slab"/>
-                <w:b/>
-                <w:bCs/>
-                <w:color w:val="7F6000"/>
-                <w:sz w:val="17"/>
-                <w:szCs w:val="17"/>
-              </w:rPr>
-              <w:t xml:space="preserve">Especialista IA - Proficiente</w:t>
-            </w:r>
-          </w:p>
-        </w:tc>
-      </w:tr>
-      <w:tr>
-        <w:tc>
-          <w:tcPr>
-            <w:tcW w:w="900" w:type="dxa"/>
-            <w:shd w:val="clear" w:color="auto" w:fill="FFF2CC"/>
-            <w:vAlign w:val="center"/>
-          </w:tcPr>
-          <w:p>
-            <w:pPr>
-              <w:spacing w:before="10" w:after="10" w:line="240" w:lineRule="auto"/>
-              <w:jc w:val="center"/>
-            </w:pPr>
-            <w:r>
-              <w:rPr>
-                <w:rFonts w:ascii="Roboto Slab" w:eastAsia="Roboto Slab" w:hAnsi="Roboto Slab" w:cs="Roboto Slab"/>
-                <w:b/>
-                <w:bCs/>
-                <w:color w:val="7F6000"/>
-                <w:sz w:val="17"/>
-                <w:szCs w:val="17"/>
-              </w:rPr>
-              <w:t xml:space="preserve">67</w:t>
-            </w:r>
-          </w:p>
-        </w:tc>
-        <w:tc>
-          <w:tcPr>
-            <w:tcW w:w="900" w:type="dxa"/>
-            <w:shd w:val="clear" w:color="auto" w:fill="FFF2CC"/>
-            <w:vAlign w:val="center"/>
-          </w:tcPr>
-          <w:p>
-            <w:pPr>
-              <w:spacing w:before="10" w:after="10" w:line="240" w:lineRule="auto"/>
-              <w:jc w:val="center"/>
-            </w:pPr>
-            <w:r>
-              <w:rPr>
-                <w:rFonts w:ascii="Roboto Slab" w:eastAsia="Roboto Slab" w:hAnsi="Roboto Slab" w:cs="Roboto Slab"/>
-                <w:b/>
-                <w:bCs/>
-                <w:color w:val="7F6000"/>
-                <w:sz w:val="17"/>
-                <w:szCs w:val="17"/>
-              </w:rPr>
-              <w:t xml:space="preserve">70</w:t>
-            </w:r>
-          </w:p>
-        </w:tc>
-        <w:tc>
-          <w:tcPr>
-            <w:tcW w:w="3600" w:type="dxa"/>
-            <w:shd w:val="clear" w:color="auto" w:fill="FFF2CC"/>
-            <w:vAlign w:val="center"/>
-          </w:tcPr>
-          <w:p>
-            <w:pPr>
-              <w:spacing w:before="10" w:after="10" w:line="240" w:lineRule="auto"/>
-              <w:jc w:val="center"/>
-            </w:pPr>
-            <w:r>
-              <w:rPr>
-                <w:rFonts w:ascii="Roboto Slab" w:eastAsia="Roboto Slab" w:hAnsi="Roboto Slab" w:cs="Roboto Slab"/>
-                <w:b/>
-                <w:bCs/>
-                <w:color w:val="7F6000"/>
-                <w:sz w:val="17"/>
-                <w:szCs w:val="17"/>
-              </w:rPr>
-              <w:t xml:space="preserve">Especialista IA - Avanzado</w:t>
-            </w:r>
-          </w:p>
-        </w:tc>
-      </w:tr>
-      <w:tr>
-        <w:tc>
-          <w:tcPr>
-            <w:tcW w:w="900" w:type="dxa"/>
-            <w:shd w:val="clear" w:color="auto" w:fill="E2EFDA"/>
-            <w:vAlign w:val="center"/>
-          </w:tcPr>
-          <w:p>
-            <w:pPr>
-              <w:spacing w:before="10" w:after="10" w:line="240" w:lineRule="auto"/>
-              <w:jc w:val="center"/>
-            </w:pPr>
-            <w:r>
-              <w:rPr>
-                <w:rFonts w:ascii="Roboto Slab" w:eastAsia="Roboto Slab" w:hAnsi="Roboto Slab" w:cs="Roboto Slab"/>
-                <w:b/>
-                <w:bCs/>
-                <w:color w:val="375623"/>
-                <w:sz w:val="17"/>
-                <w:szCs w:val="17"/>
-              </w:rPr>
-              <w:t xml:space="preserve">70</w:t>
-            </w:r>
-          </w:p>
-        </w:tc>
-        <w:tc>
-          <w:tcPr>
-            <w:tcW w:w="900" w:type="dxa"/>
-            <w:shd w:val="clear" w:color="auto" w:fill="E2EFDA"/>
-            <w:vAlign w:val="center"/>
-          </w:tcPr>
-          <w:p>
-            <w:pPr>
-              <w:spacing w:before="10" w:after="10" w:line="240" w:lineRule="auto"/>
-              <w:jc w:val="center"/>
-            </w:pPr>
-            <w:r>
-              <w:rPr>
-                <w:rFonts w:ascii="Roboto Slab" w:eastAsia="Roboto Slab" w:hAnsi="Roboto Slab" w:cs="Roboto Slab"/>
-                <w:b/>
-                <w:bCs/>
-                <w:color w:val="375623"/>
-                <w:sz w:val="17"/>
-                <w:szCs w:val="17"/>
-              </w:rPr>
-              <w:t xml:space="preserve">73</w:t>
-            </w:r>
-          </w:p>
-        </w:tc>
-        <w:tc>
-          <w:tcPr>
-            <w:tcW w:w="3600" w:type="dxa"/>
-            <w:shd w:val="clear" w:color="auto" w:fill="E2EFDA"/>
-            <w:vAlign w:val="center"/>
-          </w:tcPr>
-          <w:p>
-            <w:pPr>
-              <w:spacing w:before="10" w:after="10" w:line="240" w:lineRule="auto"/>
-              <w:jc w:val="center"/>
-            </w:pPr>
-            <w:r>
-              <w:rPr>
-                <w:rFonts w:ascii="Roboto Slab" w:eastAsia="Roboto Slab" w:hAnsi="Roboto Slab" w:cs="Roboto Slab"/>
-                <w:b/>
-                <w:bCs/>
-                <w:color w:val="375623"/>
-                <w:sz w:val="17"/>
-                <w:szCs w:val="17"/>
-              </w:rPr>
-              <w:t xml:space="preserve">Ingeniero IA - Novato</w:t>
-            </w:r>
-          </w:p>
-        </w:tc>
-      </w:tr>
-      <w:tr>
-        <w:tc>
-          <w:tcPr>
-            <w:tcW w:w="900" w:type="dxa"/>
-            <w:shd w:val="clear" w:color="auto" w:fill="E2EFDA"/>
-            <w:vAlign w:val="center"/>
-          </w:tcPr>
-          <w:p>
-            <w:pPr>
-              <w:spacing w:before="10" w:after="10" w:line="240" w:lineRule="auto"/>
-              <w:jc w:val="center"/>
-            </w:pPr>
-            <w:r>
-              <w:rPr>
-                <w:rFonts w:ascii="Roboto Slab" w:eastAsia="Roboto Slab" w:hAnsi="Roboto Slab" w:cs="Roboto Slab"/>
-                <w:b/>
-                <w:bCs/>
-                <w:color w:val="375623"/>
-                <w:sz w:val="17"/>
-                <w:szCs w:val="17"/>
-              </w:rPr>
-              <w:t xml:space="preserve">73</w:t>
-            </w:r>
-          </w:p>
-        </w:tc>
-        <w:tc>
-          <w:tcPr>
-            <w:tcW w:w="900" w:type="dxa"/>
-            <w:shd w:val="clear" w:color="auto" w:fill="E2EFDA"/>
-            <w:vAlign w:val="center"/>
-          </w:tcPr>
-          <w:p>
-            <w:pPr>
-              <w:spacing w:before="10" w:after="10" w:line="240" w:lineRule="auto"/>
-              <w:jc w:val="center"/>
-            </w:pPr>
-            <w:r>
-              <w:rPr>
-                <w:rFonts w:ascii="Roboto Slab" w:eastAsia="Roboto Slab" w:hAnsi="Roboto Slab" w:cs="Roboto Slab"/>
-                <w:b/>
-                <w:bCs/>
-                <w:color w:val="375623"/>
-                <w:sz w:val="17"/>
-                <w:szCs w:val="17"/>
-              </w:rPr>
-              <w:t xml:space="preserve">76</w:t>
-            </w:r>
-          </w:p>
-        </w:tc>
-        <w:tc>
-          <w:tcPr>
-            <w:tcW w:w="3600" w:type="dxa"/>
-            <w:shd w:val="clear" w:color="auto" w:fill="E2EFDA"/>
-            <w:vAlign w:val="center"/>
-          </w:tcPr>
-          <w:p>
-            <w:pPr>
-              <w:spacing w:before="10" w:after="10" w:line="240" w:lineRule="auto"/>
-              <w:jc w:val="center"/>
-            </w:pPr>
-            <w:r>
-              <w:rPr>
-                <w:rFonts w:ascii="Roboto Slab" w:eastAsia="Roboto Slab" w:hAnsi="Roboto Slab" w:cs="Roboto Slab"/>
-                <w:b/>
-                <w:bCs/>
-                <w:color w:val="375623"/>
-                <w:sz w:val="17"/>
-                <w:szCs w:val="17"/>
-              </w:rPr>
-              <w:t xml:space="preserve">Ingeniero IA - Principiante</w:t>
-            </w:r>
-          </w:p>
-        </w:tc>
-      </w:tr>
-      <w:tr>
-        <w:tc>
-          <w:tcPr>
-            <w:tcW w:w="900" w:type="dxa"/>
-            <w:shd w:val="clear" w:color="auto" w:fill="E2EFDA"/>
-            <w:vAlign w:val="center"/>
-          </w:tcPr>
-          <w:p>
-            <w:pPr>
-              <w:spacing w:before="10" w:after="10" w:line="240" w:lineRule="auto"/>
-              <w:jc w:val="center"/>
-            </w:pPr>
-            <w:r>
-              <w:rPr>
-                <w:rFonts w:ascii="Roboto Slab" w:eastAsia="Roboto Slab" w:hAnsi="Roboto Slab" w:cs="Roboto Slab"/>
-                <w:b/>
-                <w:bCs/>
-                <w:color w:val="375623"/>
-                <w:sz w:val="17"/>
-                <w:szCs w:val="17"/>
-              </w:rPr>
-              <w:t xml:space="preserve">76</w:t>
-            </w:r>
-          </w:p>
-        </w:tc>
-        <w:tc>
-          <w:tcPr>
-            <w:tcW w:w="900" w:type="dxa"/>
-            <w:shd w:val="clear" w:color="auto" w:fill="E2EFDA"/>
-            <w:vAlign w:val="center"/>
-          </w:tcPr>
-          <w:p>
-            <w:pPr>
-              <w:spacing w:before="10" w:after="10" w:line="240" w:lineRule="auto"/>
-              <w:jc w:val="center"/>
-            </w:pPr>
-            <w:r>
-              <w:rPr>
-                <w:rFonts w:ascii="Roboto Slab" w:eastAsia="Roboto Slab" w:hAnsi="Roboto Slab" w:cs="Roboto Slab"/>
-                <w:b/>
-                <w:bCs/>
-                <w:color w:val="375623"/>
-                <w:sz w:val="17"/>
-                <w:szCs w:val="17"/>
-              </w:rPr>
-              <w:t xml:space="preserve">79</w:t>
-            </w:r>
-          </w:p>
-        </w:tc>
-        <w:tc>
-          <w:tcPr>
-            <w:tcW w:w="3600" w:type="dxa"/>
-            <w:shd w:val="clear" w:color="auto" w:fill="E2EFDA"/>
-            <w:vAlign w:val="center"/>
-          </w:tcPr>
-          <w:p>
-            <w:pPr>
-              <w:spacing w:before="10" w:after="10" w:line="240" w:lineRule="auto"/>
-              <w:jc w:val="center"/>
-            </w:pPr>
-            <w:r>
-              <w:rPr>
-                <w:rFonts w:ascii="Roboto Slab" w:eastAsia="Roboto Slab" w:hAnsi="Roboto Slab" w:cs="Roboto Slab"/>
-                <w:b/>
-                <w:bCs/>
-                <w:color w:val="375623"/>
-                <w:sz w:val="17"/>
-                <w:szCs w:val="17"/>
-              </w:rPr>
-              <w:t xml:space="preserve">Ingeniero IA - Competente</w:t>
-            </w:r>
-          </w:p>
-        </w:tc>
-      </w:tr>
-      <w:tr>
-        <w:tc>
-          <w:tcPr>
-            <w:tcW w:w="900" w:type="dxa"/>
-            <w:shd w:val="clear" w:color="auto" w:fill="E2EFDA"/>
-            <w:vAlign w:val="center"/>
-          </w:tcPr>
-          <w:p>
-            <w:pPr>
-              <w:spacing w:before="10" w:after="10" w:line="240" w:lineRule="auto"/>
-              <w:jc w:val="center"/>
-            </w:pPr>
-            <w:r>
-              <w:rPr>
-                <w:rFonts w:ascii="Roboto Slab" w:eastAsia="Roboto Slab" w:hAnsi="Roboto Slab" w:cs="Roboto Slab"/>
-                <w:b/>
-                <w:bCs/>
-                <w:color w:val="375623"/>
-                <w:sz w:val="17"/>
-                <w:szCs w:val="17"/>
-              </w:rPr>
-              <w:t xml:space="preserve">79</w:t>
-            </w:r>
-          </w:p>
-        </w:tc>
-        <w:tc>
-          <w:tcPr>
-            <w:tcW w:w="900" w:type="dxa"/>
-            <w:shd w:val="clear" w:color="auto" w:fill="E2EFDA"/>
-            <w:vAlign w:val="center"/>
-          </w:tcPr>
-          <w:p>
-            <w:pPr>
-              <w:spacing w:before="10" w:after="10" w:line="240" w:lineRule="auto"/>
-              <w:jc w:val="center"/>
-            </w:pPr>
-            <w:r>
-              <w:rPr>
-                <w:rFonts w:ascii="Roboto Slab" w:eastAsia="Roboto Slab" w:hAnsi="Roboto Slab" w:cs="Roboto Slab"/>
-                <w:b/>
-                <w:bCs/>
-                <w:color w:val="375623"/>
-                <w:sz w:val="17"/>
-                <w:szCs w:val="17"/>
-              </w:rPr>
-              <w:t xml:space="preserve">81</w:t>
-            </w:r>
-          </w:p>
-        </w:tc>
-        <w:tc>
-          <w:tcPr>
-            <w:tcW w:w="3600" w:type="dxa"/>
-            <w:shd w:val="clear" w:color="auto" w:fill="E2EFDA"/>
-            <w:vAlign w:val="center"/>
-          </w:tcPr>
-          <w:p>
-            <w:pPr>
-              <w:spacing w:before="10" w:after="10" w:line="240" w:lineRule="auto"/>
-              <w:jc w:val="center"/>
-            </w:pPr>
-            <w:r>
-              <w:rPr>
-                <w:rFonts w:ascii="Roboto Slab" w:eastAsia="Roboto Slab" w:hAnsi="Roboto Slab" w:cs="Roboto Slab"/>
-                <w:b/>
-                <w:bCs/>
-                <w:color w:val="375623"/>
-                <w:sz w:val="17"/>
-                <w:szCs w:val="17"/>
-              </w:rPr>
-              <w:t xml:space="preserve">Ingeniero IA - Proficiente</w:t>
-            </w:r>
-          </w:p>
-        </w:tc>
-      </w:tr>
-      <w:tr>
-        <w:tc>
-          <w:tcPr>
-            <w:tcW w:w="900" w:type="dxa"/>
-            <w:shd w:val="clear" w:color="auto" w:fill="E2EFDA"/>
-            <w:vAlign w:val="center"/>
-          </w:tcPr>
-          <w:p>
-            <w:pPr>
-              <w:spacing w:before="10" w:after="10" w:line="240" w:lineRule="auto"/>
-              <w:jc w:val="center"/>
-            </w:pPr>
-            <w:r>
-              <w:rPr>
-                <w:rFonts w:ascii="Roboto Slab" w:eastAsia="Roboto Slab" w:hAnsi="Roboto Slab" w:cs="Roboto Slab"/>
-                <w:b/>
-                <w:bCs/>
-                <w:color w:val="375623"/>
-                <w:sz w:val="17"/>
-                <w:szCs w:val="17"/>
-              </w:rPr>
-              <w:t xml:space="preserve">81</w:t>
-            </w:r>
-          </w:p>
-        </w:tc>
-        <w:tc>
-          <w:tcPr>
-            <w:tcW w:w="900" w:type="dxa"/>
-            <w:shd w:val="clear" w:color="auto" w:fill="E2EFDA"/>
-            <w:vAlign w:val="center"/>
-          </w:tcPr>
-          <w:p>
-            <w:pPr>
-              <w:spacing w:before="10" w:after="10" w:line="240" w:lineRule="auto"/>
-              <w:jc w:val="center"/>
-            </w:pPr>
-            <w:r>
-              <w:rPr>
-                <w:rFonts w:ascii="Roboto Slab" w:eastAsia="Roboto Slab" w:hAnsi="Roboto Slab" w:cs="Roboto Slab"/>
-                <w:b/>
-                <w:bCs/>
-                <w:color w:val="375623"/>
-                <w:sz w:val="17"/>
-                <w:szCs w:val="17"/>
-              </w:rPr>
-              <w:t xml:space="preserve">85</w:t>
-            </w:r>
-          </w:p>
-        </w:tc>
-        <w:tc>
-          <w:tcPr>
-            <w:tcW w:w="3600" w:type="dxa"/>
-            <w:shd w:val="clear" w:color="auto" w:fill="E2EFDA"/>
-            <w:vAlign w:val="center"/>
-          </w:tcPr>
-          <w:p>
-            <w:pPr>
-              <w:spacing w:before="10" w:after="10" w:line="240" w:lineRule="auto"/>
-              <w:jc w:val="center"/>
-            </w:pPr>
-            <w:r>
-              <w:rPr>
-                <w:rFonts w:ascii="Roboto Slab" w:eastAsia="Roboto Slab" w:hAnsi="Roboto Slab" w:cs="Roboto Slab"/>
-                <w:b/>
-                <w:bCs/>
-                <w:color w:val="375623"/>
-                <w:sz w:val="17"/>
-                <w:szCs w:val="17"/>
-              </w:rPr>
-              <w:t xml:space="preserve">Ingeniero IA - Avanzado</w:t>
-            </w:r>
-          </w:p>
-        </w:tc>
-      </w:tr>
-      <w:tr>
-        <w:tc>
-          <w:tcPr>
-            <w:tcW w:w="900" w:type="dxa"/>
+            <w:tcW w:w="1000" w:type="dxa"/>
             <w:shd w:val="clear" w:color="auto" w:fill="C6EFCE"/>
             <w:vAlign w:val="center"/>
           </w:tcPr>
           <w:p>
             <w:pPr>
-              <w:spacing w:before="10" w:after="10" w:line="240" w:lineRule="auto"/>
+              <w:spacing w:before="30" w:after="30" w:line="240" w:lineRule="auto"/>
               <w:jc w:val="center"/>
             </w:pPr>
             <w:r>
@@ -1950,8 +1361,8 @@
                 <w:b/>
                 <w:bCs/>
                 <w:color w:val="006100"/>
-                <w:sz w:val="17"/>
-                <w:szCs w:val="17"/>
+                <w:sz w:val="19"/>
+                <w:szCs w:val="19"/>
               </w:rPr>
               <w:t xml:space="preserve">85</w:t>
             </w:r>
@@ -1959,13 +1370,13 @@
         </w:tc>
         <w:tc>
           <w:tcPr>
-            <w:tcW w:w="900" w:type="dxa"/>
+            <w:tcW w:w="1000" w:type="dxa"/>
             <w:shd w:val="clear" w:color="auto" w:fill="C6EFCE"/>
             <w:vAlign w:val="center"/>
           </w:tcPr>
           <w:p>
             <w:pPr>
-              <w:spacing w:before="10" w:after="10" w:line="240" w:lineRule="auto"/>
+              <w:spacing w:before="30" w:after="30" w:line="240" w:lineRule="auto"/>
               <w:jc w:val="center"/>
             </w:pPr>
             <w:r>
@@ -1974,8 +1385,8 @@
                 <w:b/>
                 <w:bCs/>
                 <w:color w:val="006100"/>
-                <w:sz w:val="17"/>
-                <w:szCs w:val="17"/>
+                <w:sz w:val="19"/>
+                <w:szCs w:val="19"/>
               </w:rPr>
               <w:t xml:space="preserve">100</w:t>
             </w:r>
@@ -1983,13 +1394,13 @@
         </w:tc>
         <w:tc>
           <w:tcPr>
-            <w:tcW w:w="3600" w:type="dxa"/>
+            <w:tcW w:w="3400" w:type="dxa"/>
             <w:shd w:val="clear" w:color="auto" w:fill="C6EFCE"/>
             <w:vAlign w:val="center"/>
           </w:tcPr>
           <w:p>
             <w:pPr>
-              <w:spacing w:before="10" w:after="10" w:line="240" w:lineRule="auto"/>
+              <w:spacing w:before="30" w:after="30" w:line="240" w:lineRule="auto"/>
               <w:jc w:val="center"/>
             </w:pPr>
             <w:r>
@@ -1998,10 +1409,10 @@
                 <w:b/>
                 <w:bCs/>
                 <w:color w:val="006100"/>
-                <w:sz w:val="17"/>
-                <w:szCs w:val="17"/>
-              </w:rPr>
-              <w:t xml:space="preserve">Ingeniero IA SR</w:t>
+                <w:sz w:val="19"/>
+                <w:szCs w:val="19"/>
+              </w:rPr>
+              <w:t xml:space="preserve">Ingeniero Software IA SR</w:t>
             </w:r>
           </w:p>
         </w:tc>
@@ -2109,11 +1520,11 @@
                 <w:rFonts w:ascii="Segoe UI" w:hAnsi="Segoe UI" w:cs="Segoe UI"/>
                 <w:b/>
                 <w:bCs/>
-                <w:color w:val="1F3864"/>
+                <w:color w:val="C00000"/>
                 <w:sz w:val="22"/>
                 <w:szCs w:val="22"/>
               </w:rPr>
-              <w:t xml:space="preserve">PRÁCTICA 60/100 – NOTA FINAL PENDIENTE</w:t>
+              <w:t xml:space="preserve">NO APROBADO</w:t>
             </w:r>
           </w:p>
         </w:tc>
@@ -2475,7 +1886,7 @@
           <w:sz w:val="20"/>
           <w:szCs w:val="20"/>
         </w:rPr>
-        <w:t xml:space="preserve">El reto consistía en construir un agente orquestador para el onboarding digital de un cliente bancario: coordinar sub-agentes de identidad, listas de riesgo, documentación y respuesta al cliente, con una allowlist de herramientas por agente, manejo de estado, escalamiento a un humano, registro de decisiones y límites de 10 pasos y 30 segundos.</w:t>
+        <w:t xml:space="preserve">El reto (variante B) consistía en construir un agente orquestador para el onboarding digital de un cliente bancario: coordinar sub-agentes de identidad, listas de riesgo, documentación y respuesta al cliente, con allowlist de herramientas por agente, manejo de estado, escalamiento a un humano, registro de decisiones y límites de 10 pasos y 30 segundos.</w:t>
       </w:r>
     </w:p>
     <w:p>
@@ -2489,7 +1900,7 @@
           <w:sz w:val="20"/>
           <w:szCs w:val="20"/>
         </w:rPr>
-        <w:t xml:space="preserve">El candidato obtuvo 60/100 en la prueba práctica (diseño 13/20, implementación 23/40, defensa 24/40). Entregó un flujo que funciona de punta a punta, con un orquestador en LangGraph que elige agentes mediante function calling, reglas de negocio deterministas, allowlist de herramientas y servidores MCP reales. Las principales brechas son la ausencia de autenticación, de pruebas automatizadas y de mecanismos de resiliencia entre servicios, y varias diferencias entre el diagrama y el código (A2A, base vectorial y handoff al asesor). La nota final queda pendiente de la evaluación teórica.</w:t>
+        <w:t xml:space="preserve">El candidato no aprobó ninguna de las dos pruebas: obtuvo 12/20 en la teórica y 47/100 en la práctica (diseño 6/20, implementación 22/40, defensa 19/40). Su nota final es 5,04 sobre 10. Logró ejecutar el flujo completo, pero el diseño no constituye una arquitectura, el código no tiene una estructura correcta y en la defensa no pudo explicar su arquitectura ni cómo integrar en conjunto los conceptos de IA que conoce.</w:t>
       </w:r>
     </w:p>
     <w:p>
@@ -2521,7 +1932,7 @@
           <w:sz w:val="20"/>
           <w:szCs w:val="20"/>
         </w:rPr>
-        <w:t xml:space="preserve">Según su CV, trabaja desde 2024 como ingeniero de IA y datos en el sector financiero, con agentes en producción sobre LangGraph, AWS Bedrock y Azure AI Foundry, y un servidor MCP remoto. Antes de programar escribió una especificación, un plan y una lista de tareas (carpeta specs/). En la defensa reconoció con sinceridad lo que no estaba implementado y lo que no tenía claro del enunciado.</w:t>
+        <w:t xml:space="preserve">Declara 2 años de experiencia en IA y datos en el sector financiero. Maneja la terminología general de IA generativa (agentes, MCP, LangGraph, parámetros de los modelos) y herramientas de observabilidad. Antes de programar escribió una especificación, un plan y una lista de tareas.</w:t>
       </w:r>
     </w:p>
     <w:p>
@@ -2553,7 +1964,7 @@
           <w:sz w:val="20"/>
           <w:szCs w:val="20"/>
         </w:rPr>
-        <w:t xml:space="preserve">Reconoce sus límites: admitió que la comunicación entre agentes no es A2A sino HTTP, que no implementó autenticación ni resiliencia, y que algunas partes del enunciado no le quedaron claras. Algunas respuestas fueron extensas y poco estructuradas, y en ocasiones necesitó repreguntas para llegar al punto (por ejemplo, al describir las capas de su arquitectura).</w:t>
+        <w:t xml:space="preserve">Reconoció con sinceridad lo que no estaba implementado (autenticación, resiliencia, comunicación A2A) y lo que no tenía claro del enunciado. Sus respuestas fueron extensas y poco estructuradas, y necesitó repreguntas para llegar al punto, por ejemplo al describir las capas de su arquitectura.</w:t>
       </w:r>
     </w:p>
     <w:p>
@@ -2655,7 +2066,7 @@
                 <w:sz w:val="19"/>
                 <w:szCs w:val="19"/>
               </w:rPr>
-              <w:t xml:space="preserve">Cumplimiento</w:t>
+              <w:t xml:space="preserve">Equivalente /10</w:t>
             </w:r>
           </w:p>
         </w:tc>
@@ -2680,7 +2091,7 @@
                 <w:sz w:val="19"/>
                 <w:szCs w:val="19"/>
               </w:rPr>
-              <w:t xml:space="preserve">Evaluación teórica</w:t>
+              <w:t xml:space="preserve">Evaluación teórica (variante B)</w:t>
             </w:r>
           </w:p>
         </w:tc>
@@ -2700,7 +2111,7 @@
                 <w:sz w:val="19"/>
                 <w:szCs w:val="19"/>
               </w:rPr>
-              <w:t xml:space="preserve">[Por completar]</w:t>
+              <w:t xml:space="preserve">12 / 20</w:t>
             </w:r>
           </w:p>
         </w:tc>
@@ -2720,7 +2131,7 @@
                 <w:sz w:val="19"/>
                 <w:szCs w:val="19"/>
               </w:rPr>
-              <w:t xml:space="preserve">—</w:t>
+              <w:t xml:space="preserve">6,00</w:t>
             </w:r>
           </w:p>
         </w:tc>
@@ -2765,7 +2176,7 @@
                 <w:sz w:val="19"/>
                 <w:szCs w:val="19"/>
               </w:rPr>
-              <w:t xml:space="preserve">13 / 20</w:t>
+              <w:t xml:space="preserve">6 / 20</w:t>
             </w:r>
           </w:p>
         </w:tc>
@@ -2785,7 +2196,7 @@
                 <w:sz w:val="19"/>
                 <w:szCs w:val="19"/>
               </w:rPr>
-              <w:t xml:space="preserve">65 %</w:t>
+              <w:t xml:space="preserve">3,00</w:t>
             </w:r>
           </w:p>
         </w:tc>
@@ -2830,7 +2241,7 @@
                 <w:sz w:val="19"/>
                 <w:szCs w:val="19"/>
               </w:rPr>
-              <w:t xml:space="preserve">23 / 40</w:t>
+              <w:t xml:space="preserve">22 / 40</w:t>
             </w:r>
           </w:p>
         </w:tc>
@@ -2850,7 +2261,7 @@
                 <w:sz w:val="19"/>
                 <w:szCs w:val="19"/>
               </w:rPr>
-              <w:t xml:space="preserve">58 %</w:t>
+              <w:t xml:space="preserve">5,50</w:t>
             </w:r>
           </w:p>
         </w:tc>
@@ -2895,7 +2306,7 @@
                 <w:sz w:val="19"/>
                 <w:szCs w:val="19"/>
               </w:rPr>
-              <w:t xml:space="preserve">24 / 40</w:t>
+              <w:t xml:space="preserve">19 / 40</w:t>
             </w:r>
           </w:p>
         </w:tc>
@@ -2915,7 +2326,7 @@
                 <w:sz w:val="19"/>
                 <w:szCs w:val="19"/>
               </w:rPr>
-              <w:t xml:space="preserve">60 %</w:t>
+              <w:t xml:space="preserve">4,75</w:t>
             </w:r>
           </w:p>
         </w:tc>
@@ -2943,7 +2354,7 @@
                 <w:sz w:val="19"/>
                 <w:szCs w:val="19"/>
               </w:rPr>
-              <w:t xml:space="preserve">Total prueba práctica</w:t>
+              <w:t xml:space="preserve">Total prueba práctica (variante B)</w:t>
             </w:r>
           </w:p>
         </w:tc>
@@ -2966,7 +2377,7 @@
                 <w:sz w:val="19"/>
                 <w:szCs w:val="19"/>
               </w:rPr>
-              <w:t xml:space="preserve">60 / 100</w:t>
+              <w:t xml:space="preserve">47 / 100</w:t>
             </w:r>
           </w:p>
         </w:tc>
@@ -2989,7 +2400,7 @@
                 <w:sz w:val="19"/>
                 <w:szCs w:val="19"/>
               </w:rPr>
-              <w:t xml:space="preserve">60 %</w:t>
+              <w:t xml:space="preserve">4,88</w:t>
             </w:r>
           </w:p>
         </w:tc>
@@ -3017,7 +2428,7 @@
                 <w:sz w:val="19"/>
                 <w:szCs w:val="19"/>
               </w:rPr>
-              <w:t xml:space="preserve">Nota final (20 % teórica + 80 % práctica)</w:t>
+              <w:t xml:space="preserve">Nota final (teórica + práctica)</w:t>
             </w:r>
           </w:p>
         </w:tc>
@@ -3040,7 +2451,7 @@
                 <w:sz w:val="19"/>
                 <w:szCs w:val="19"/>
               </w:rPr>
-              <w:t xml:space="preserve">Pendiente</w:t>
+              <w:t xml:space="preserve">—</w:t>
             </w:r>
           </w:p>
         </w:tc>
@@ -3063,7 +2474,7 @@
                 <w:sz w:val="19"/>
                 <w:szCs w:val="19"/>
               </w:rPr>
-              <w:t xml:space="preserve">—</w:t>
+              <w:t xml:space="preserve">5,04</w:t>
             </w:r>
           </w:p>
         </w:tc>
@@ -3240,7 +2651,7 @@
                 <w:sz w:val="19"/>
                 <w:szCs w:val="19"/>
               </w:rPr>
-              <w:t xml:space="preserve">3 / 6</w:t>
+              <w:t xml:space="preserve">0 / 6</w:t>
             </w:r>
           </w:p>
         </w:tc>
@@ -3306,7 +2717,7 @@
                 <w:sz w:val="19"/>
                 <w:szCs w:val="19"/>
               </w:rPr>
-              <w:t xml:space="preserve">6 / 8</w:t>
+              <w:t xml:space="preserve">4 / 8</w:t>
             </w:r>
           </w:p>
         </w:tc>
@@ -3372,7 +2783,7 @@
                 <w:sz w:val="19"/>
                 <w:szCs w:val="19"/>
               </w:rPr>
-              <w:t xml:space="preserve">4 / 6</w:t>
+              <w:t xml:space="preserve">2 / 6</w:t>
             </w:r>
           </w:p>
         </w:tc>
@@ -3444,7 +2855,7 @@
                 <w:sz w:val="19"/>
                 <w:szCs w:val="19"/>
               </w:rPr>
-              <w:t xml:space="preserve">13 / 20</w:t>
+              <w:t xml:space="preserve">6 / 20</w:t>
             </w:r>
           </w:p>
         </w:tc>
@@ -3510,7 +2921,7 @@
                 <w:sz w:val="19"/>
                 <w:szCs w:val="19"/>
               </w:rPr>
-              <w:t xml:space="preserve">3 / 4</w:t>
+              <w:t xml:space="preserve">4 / 4</w:t>
             </w:r>
           </w:p>
         </w:tc>
@@ -3642,7 +3053,7 @@
                 <w:sz w:val="19"/>
                 <w:szCs w:val="19"/>
               </w:rPr>
-              <w:t xml:space="preserve">3 / 4</w:t>
+              <w:t xml:space="preserve">2 / 4</w:t>
             </w:r>
           </w:p>
         </w:tc>
@@ -3708,7 +3119,7 @@
                 <w:sz w:val="19"/>
                 <w:szCs w:val="19"/>
               </w:rPr>
-              <w:t xml:space="preserve">6 / 8</w:t>
+              <w:t xml:space="preserve">4 / 8</w:t>
             </w:r>
           </w:p>
         </w:tc>
@@ -3774,7 +3185,7 @@
                 <w:sz w:val="19"/>
                 <w:szCs w:val="19"/>
               </w:rPr>
-              <w:t xml:space="preserve">4 / 6</w:t>
+              <w:t xml:space="preserve">3 / 6</w:t>
             </w:r>
           </w:p>
         </w:tc>
@@ -3840,7 +3251,7 @@
                 <w:sz w:val="19"/>
                 <w:szCs w:val="19"/>
               </w:rPr>
-              <w:t xml:space="preserve">2 / 6</w:t>
+              <w:t xml:space="preserve">3 / 6</w:t>
             </w:r>
           </w:p>
         </w:tc>
@@ -3886,7 +3297,7 @@
                 <w:sz w:val="19"/>
                 <w:szCs w:val="19"/>
               </w:rPr>
-              <w:t xml:space="preserve">Calidad del código</w:t>
+              <w:t xml:space="preserve">Generación del código</w:t>
             </w:r>
           </w:p>
         </w:tc>
@@ -3906,7 +3317,7 @@
                 <w:sz w:val="19"/>
                 <w:szCs w:val="19"/>
               </w:rPr>
-              <w:t xml:space="preserve">2 / 6</w:t>
+              <w:t xml:space="preserve">3 / 6</w:t>
             </w:r>
           </w:p>
         </w:tc>
@@ -3978,7 +3389,7 @@
                 <w:sz w:val="19"/>
                 <w:szCs w:val="19"/>
               </w:rPr>
-              <w:t xml:space="preserve">23 / 40</w:t>
+              <w:t xml:space="preserve">22 / 40</w:t>
             </w:r>
           </w:p>
         </w:tc>
@@ -4044,7 +3455,7 @@
                 <w:sz w:val="19"/>
                 <w:szCs w:val="19"/>
               </w:rPr>
-              <w:t xml:space="preserve">6 / 10</w:t>
+              <w:t xml:space="preserve">5 / 10</w:t>
             </w:r>
           </w:p>
         </w:tc>
@@ -4090,7 +3501,7 @@
                 <w:sz w:val="19"/>
                 <w:szCs w:val="19"/>
               </w:rPr>
-              <w:t xml:space="preserve">Decisiones de código</w:t>
+              <w:t xml:space="preserve">Decisiones de código e IA</w:t>
             </w:r>
           </w:p>
         </w:tc>
@@ -4110,7 +3521,7 @@
                 <w:sz w:val="19"/>
                 <w:szCs w:val="19"/>
               </w:rPr>
-              <w:t xml:space="preserve">5 / 8</w:t>
+              <w:t xml:space="preserve">3 / 8</w:t>
             </w:r>
           </w:p>
         </w:tc>
@@ -4242,7 +3653,7 @@
                 <w:sz w:val="19"/>
                 <w:szCs w:val="19"/>
               </w:rPr>
-              <w:t xml:space="preserve">5 / 8</w:t>
+              <w:t xml:space="preserve">4 / 8</w:t>
             </w:r>
           </w:p>
         </w:tc>
@@ -4308,7 +3719,7 @@
                 <w:sz w:val="19"/>
                 <w:szCs w:val="19"/>
               </w:rPr>
-              <w:t xml:space="preserve">5 / 8</w:t>
+              <w:t xml:space="preserve">4 / 8</w:t>
             </w:r>
           </w:p>
         </w:tc>
@@ -4380,7 +3791,7 @@
                 <w:sz w:val="19"/>
                 <w:szCs w:val="19"/>
               </w:rPr>
-              <w:t xml:space="preserve">24 / 40</w:t>
+              <w:t xml:space="preserve">19 / 40</w:t>
             </w:r>
           </w:p>
         </w:tc>
@@ -4407,7 +3818,7 @@
           <w:sz w:val="22"/>
           <w:szCs w:val="22"/>
         </w:rPr>
-        <w:t xml:space="preserve">Diseño de arquitectura: 13 / 20</w:t>
+        <w:t xml:space="preserve">Evaluación teórica: 12 / 20 (reprobada)</w:t>
       </w:r>
     </w:p>
     <w:p>
@@ -4421,79 +3832,7 @@
           <w:sz w:val="20"/>
           <w:szCs w:val="20"/>
         </w:rPr>
-        <w:t xml:space="preserve">El diagrama muestra al usuario que llama a POST /onboarding, un agente orquestador que se comunica por A2A con cuatro agentes (identidad, riesgos, documentación y respuesta al cliente). Cada agente accede a sus datos mediante un servidor MCP: clientes, catálogo de listas de riesgo y una base vectorial con su flujo de ingesta. Incluye un handoff al asesor humano y un tópico de Kafka para la trazabilidad de todos los agentes.</w:t>
-      </w:r>
-    </w:p>
-    <w:p>
-      <w:pPr>
-        <w:spacing w:before="0" w:after="120" w:line="264" w:lineRule="auto"/>
-        <w:jc w:val="both"/>
-      </w:pPr>
-      <w:r>
-        <w:rPr>
-          <w:rFonts w:ascii="Roboto Slab" w:eastAsia="Roboto Slab" w:hAnsi="Roboto Slab" w:cs="Roboto Slab"/>
-          <w:b/>
-          <w:bCs/>
-          <w:sz w:val="20"/>
-          <w:szCs w:val="20"/>
-        </w:rPr>
-        <w:t xml:space="preserve">Uso de capas (3/6). </w:t>
-      </w:r>
-      <w:r>
-        <w:rPr>
-          <w:rFonts w:ascii="Roboto Slab" w:eastAsia="Roboto Slab" w:hAnsi="Roboto Slab" w:cs="Roboto Slab"/>
-          <w:sz w:val="20"/>
-          <w:szCs w:val="20"/>
-        </w:rPr>
-        <w:t xml:space="preserve">La arquitectura es simple y no representa capas ni autenticación. Al preguntarle, describió las capas que usaría: canal expuesto al usuario, dominio de negocio (un agente por dominio), datos, y observabilidad y seguridad como capas transversales. Conoce las capas pero no las llevó al diseño.</w:t>
-      </w:r>
-    </w:p>
-    <w:p>
-      <w:pPr>
-        <w:spacing w:before="0" w:after="120" w:line="264" w:lineRule="auto"/>
-        <w:jc w:val="both"/>
-      </w:pPr>
-      <w:r>
-        <w:rPr>
-          <w:rFonts w:ascii="Roboto Slab" w:eastAsia="Roboto Slab" w:hAnsi="Roboto Slab" w:cs="Roboto Slab"/>
-          <w:b/>
-          <w:bCs/>
-          <w:sz w:val="20"/>
-          <w:szCs w:val="20"/>
-        </w:rPr>
-        <w:t xml:space="preserve">Aplicabilidad al escenario (6/8). </w:t>
-      </w:r>
-      <w:r>
-        <w:rPr>
-          <w:rFonts w:ascii="Roboto Slab" w:eastAsia="Roboto Slab" w:hAnsi="Roboto Slab" w:cs="Roboto Slab"/>
-          <w:sz w:val="20"/>
-          <w:szCs w:val="20"/>
-        </w:rPr>
-        <w:t xml:space="preserve">El diseño cubre todos los requisitos del caso: los cuatro agentes, una herramienta por dominio expuesta por MCP (con patrón fachada sobre las fuentes de datos), el escalamiento al asesor y la trazabilidad. Justificó Kafka para que la observabilidad no agregue latencia al flujo, a partir de una experiencia real. Le falta mostrar dónde se guarda el estado y cómo vuelve la respuesta del asesor al proceso.</w:t>
-      </w:r>
-    </w:p>
-    <w:p>
-      <w:pPr>
-        <w:spacing w:before="0" w:after="120" w:line="264" w:lineRule="auto"/>
-        <w:jc w:val="both"/>
-      </w:pPr>
-      <w:r>
-        <w:rPr>
-          <w:rFonts w:ascii="Roboto Slab" w:eastAsia="Roboto Slab" w:hAnsi="Roboto Slab" w:cs="Roboto Slab"/>
-          <w:b/>
-          <w:bCs/>
-          <w:sz w:val="20"/>
-          <w:szCs w:val="20"/>
-        </w:rPr>
-        <w:t xml:space="preserve">Controles (4/6). </w:t>
-      </w:r>
-      <w:r>
-        <w:rPr>
-          <w:rFonts w:ascii="Roboto Slab" w:eastAsia="Roboto Slab" w:hAnsi="Roboto Slab" w:cs="Roboto Slab"/>
-          <w:sz w:val="20"/>
-          <w:szCs w:val="20"/>
-        </w:rPr>
-        <w:t xml:space="preserve">En la defensa planteó circuit breaker, fallback de modelos mediante un AI gateway, degradación (el orquestador responde aunque falle un sub-agente) y guardrails en la entrada y salida del orquestador. Ninguno de estos controles aparece en el diagrama.</w:t>
+        <w:t xml:space="preserve">No alcanzó el puntaje mínimo de aprobación en la prueba teórica.</w:t>
       </w:r>
     </w:p>
     <w:p>
@@ -4511,7 +3850,7 @@
           <w:sz w:val="22"/>
           <w:szCs w:val="22"/>
         </w:rPr>
-        <w:t xml:space="preserve">Implementación: 23 / 40</w:t>
+        <w:t xml:space="preserve">Diseño de arquitectura: 6 / 20</w:t>
       </w:r>
     </w:p>
     <w:p>
@@ -4525,7 +3864,7 @@
           <w:sz w:val="20"/>
           <w:szCs w:val="20"/>
         </w:rPr>
-        <w:t xml:space="preserve">La solución está organizada en siete servicios con Docker Compose (orquestador, tres agentes y tres servidores MCP), una librería común y Kafka. El repositorio tiene un solo commit.</w:t>
+        <w:t xml:space="preserve">El diagrama presentado es un flujograma: muestra al usuario, un agente orquestador que llama a cuatro agentes, servidores MCP hacia las fuentes de datos, un handoff al asesor y un tópico de Kafka para la trazabilidad. No representa un diseño de arquitectura.</w:t>
       </w:r>
     </w:p>
     <w:p>
@@ -4541,7 +3880,7 @@
           <w:sz w:val="20"/>
           <w:szCs w:val="20"/>
         </w:rPr>
-        <w:t xml:space="preserve">Flujo realizado (3/4). </w:t>
+        <w:t xml:space="preserve">Uso de capas (0/6). </w:t>
       </w:r>
       <w:r>
         <w:rPr>
@@ -4549,7 +3888,97 @@
           <w:sz w:val="20"/>
           <w:szCs w:val="20"/>
         </w:rPr>
-        <w:t xml:space="preserve">Ejecutó el flujo completo y mostró respuestas aprobadas y escaladas, con trace_id, pasos y estado. El handoff al asesor se limita a marcar el caso como escalado con una solución propuesta; no hay cola ni canal hacia el asesor.</w:t>
+        <w:t xml:space="preserve">El diseño no presenta capas ni división de responsabilidades. Solo al repreguntarle mencionó qué capas usaría (canal, dominio, datos, y observabilidad y seguridad transversales), pero no forman parte del diseño.</w:t>
+      </w:r>
+    </w:p>
+    <w:p>
+      <w:pPr>
+        <w:spacing w:before="0" w:after="120" w:line="264" w:lineRule="auto"/>
+        <w:jc w:val="both"/>
+      </w:pPr>
+      <w:r>
+        <w:rPr>
+          <w:rFonts w:ascii="Roboto Slab" w:eastAsia="Roboto Slab" w:hAnsi="Roboto Slab" w:cs="Roboto Slab"/>
+          <w:b/>
+          <w:bCs/>
+          <w:sz w:val="20"/>
+          <w:szCs w:val="20"/>
+        </w:rPr>
+        <w:t xml:space="preserve">Aplicabilidad al escenario (4/8). </w:t>
+      </w:r>
+      <w:r>
+        <w:rPr>
+          <w:rFonts w:ascii="Roboto Slab" w:eastAsia="Roboto Slab" w:hAnsi="Roboto Slab" w:cs="Roboto Slab"/>
+          <w:sz w:val="20"/>
+          <w:szCs w:val="20"/>
+        </w:rPr>
+        <w:t xml:space="preserve">El flujo nombra los agentes y fuentes de datos que pide el caso, pero no muestra autenticación, manejo del estado ni cómo vuelve la respuesta del asesor al proceso.</w:t>
+      </w:r>
+    </w:p>
+    <w:p>
+      <w:pPr>
+        <w:spacing w:before="0" w:after="120" w:line="264" w:lineRule="auto"/>
+        <w:jc w:val="both"/>
+      </w:pPr>
+      <w:r>
+        <w:rPr>
+          <w:rFonts w:ascii="Roboto Slab" w:eastAsia="Roboto Slab" w:hAnsi="Roboto Slab" w:cs="Roboto Slab"/>
+          <w:b/>
+          <w:bCs/>
+          <w:sz w:val="20"/>
+          <w:szCs w:val="20"/>
+        </w:rPr>
+        <w:t xml:space="preserve">Controles (2/6). </w:t>
+      </w:r>
+      <w:r>
+        <w:rPr>
+          <w:rFonts w:ascii="Roboto Slab" w:eastAsia="Roboto Slab" w:hAnsi="Roboto Slab" w:cs="Roboto Slab"/>
+          <w:sz w:val="20"/>
+          <w:szCs w:val="20"/>
+        </w:rPr>
+        <w:t xml:space="preserve">Incluye un componente de observabilidad (tópico de Kafka), pero no es escalable. El diseño no contiene controles de resiliencia ni de seguridad.</w:t>
+      </w:r>
+    </w:p>
+    <w:p>
+      <w:pPr>
+        <w:keepNext/>
+        <w:spacing w:before="200" w:after="80" w:line="264" w:lineRule="auto"/>
+        <w:jc w:val="left"/>
+      </w:pPr>
+      <w:r>
+        <w:rPr>
+          <w:rFonts w:ascii="Roboto Slab" w:eastAsia="Roboto Slab" w:hAnsi="Roboto Slab" w:cs="Roboto Slab"/>
+          <w:b/>
+          <w:bCs/>
+          <w:color w:val="1F3864"/>
+          <w:sz w:val="22"/>
+          <w:szCs w:val="22"/>
+        </w:rPr>
+        <w:t xml:space="preserve">Implementación: 22 / 40</w:t>
+      </w:r>
+    </w:p>
+    <w:p>
+      <w:pPr>
+        <w:spacing w:before="0" w:after="120" w:line="264" w:lineRule="auto"/>
+        <w:jc w:val="both"/>
+      </w:pPr>
+      <w:r>
+        <w:rPr>
+          <w:rFonts w:ascii="Roboto Slab" w:eastAsia="Roboto Slab" w:hAnsi="Roboto Slab" w:cs="Roboto Slab"/>
+          <w:b/>
+          <w:bCs/>
+          <w:sz w:val="20"/>
+          <w:szCs w:val="20"/>
+        </w:rPr>
+        <w:t xml:space="preserve">Flujo realizado (4/4). </w:t>
+      </w:r>
+      <w:r>
+        <w:rPr>
+          <w:rFonts w:ascii="Roboto Slab" w:eastAsia="Roboto Slab" w:hAnsi="Roboto Slab" w:cs="Roboto Slab"/>
+          <w:sz w:val="20"/>
+          <w:szCs w:val="20"/>
+        </w:rPr>
+        <w:t xml:space="preserve">Ejecutó el flujo completo y mostró respuestas aprobadas y escaladas, con identificador de traza, pasos y estado.</w:t>
       </w:r>
     </w:p>
     <w:p>
@@ -4573,7 +4002,7 @@
           <w:sz w:val="20"/>
           <w:szCs w:val="20"/>
         </w:rPr>
-        <w:t xml:space="preserve">El endpoint valida el esquema con Pydantic (por ejemplo, document_id de 10 dígitos). No tiene autenticación ni rate limiting; mencionó JWT pero no lo implementó.</w:t>
+        <w:t xml:space="preserve">El endpoint valida el esquema de entrada (por ejemplo, cédula de 10 dígitos), pero no tiene autenticación ni autorización.</w:t>
       </w:r>
     </w:p>
     <w:p>
@@ -4589,7 +4018,7 @@
           <w:sz w:val="20"/>
           <w:szCs w:val="20"/>
         </w:rPr>
-        <w:t xml:space="preserve">Componentes y contenedores (3/4). </w:t>
+        <w:t xml:space="preserve">Componentes y contenedores (2/4). </w:t>
       </w:r>
       <w:r>
         <w:rPr>
@@ -4597,7 +4026,7 @@
           <w:sz w:val="20"/>
           <w:szCs w:val="20"/>
         </w:rPr>
-        <w:t xml:space="preserve">Separa cada agente y cada servidor MCP en su propio servicio con Dockerfile, y la librería común tiene dominio, aplicación e infraestructura. Siete servicios es una separación amplia para el tamaño del caso.</w:t>
+        <w:t xml:space="preserve">Cada agente y cada servidor MCP está en su propia carpeta y contenedor, pero la arquitectura del código no es correcta y el candidato no identificó con claridad la responsabilidad de cada componente.</w:t>
       </w:r>
     </w:p>
     <w:p>
@@ -4613,7 +4042,7 @@
           <w:sz w:val="20"/>
           <w:szCs w:val="20"/>
         </w:rPr>
-        <w:t xml:space="preserve">Capa de agente (6/8). </w:t>
+        <w:t xml:space="preserve">Capa de agente (4/8). </w:t>
       </w:r>
       <w:r>
         <w:rPr>
@@ -4621,7 +4050,7 @@
           <w:sz w:val="20"/>
           <w:szCs w:val="20"/>
         </w:rPr>
-        <w:t xml:space="preserve">Es su punto más fuerte. El orquestador es un grafo de LangGraph donde el LLM elige qué agente invocar mediante function calling, pero los datos de entrada salen del request validado y no de los argumentos del modelo. Unas precondiciones deterministas impiden saltarse pasos, y los umbrales de negocio (confianza menor a 0.8, riesgo alto) se evalúan en código. Tiene allowlist por agente en un archivo YAML, aplicada por un ToolGuard que además registra los intentos denegados, y límites de pasos y de tiempo. No guarda el estado (el grafo no tiene checkpointer), así que un caso escalado no puede retomarse. Cada sub-agente es un ciclo LLM con una sola herramienta, que en la práctica podría ser una llamada directa.</w:t>
+        <w:t xml:space="preserve">El orquestador usa function calling y aplica las reglas de negocio y la allowlist en código. No guarda el estado entre pasos, por lo que un caso escalado no puede retomarse, y el handoff al asesor se limita a marcar el caso como escalado.</w:t>
       </w:r>
     </w:p>
     <w:p>
@@ -4637,7 +4066,7 @@
           <w:sz w:val="20"/>
           <w:szCs w:val="20"/>
         </w:rPr>
-        <w:t xml:space="preserve">Capa de integración (4/6). </w:t>
+        <w:t xml:space="preserve">Capa de integración (3/6). </w:t>
       </w:r>
       <w:r>
         <w:rPr>
@@ -4645,7 +4074,7 @@
           <w:sz w:val="20"/>
           <w:szCs w:val="20"/>
         </w:rPr>
-        <w:t xml:space="preserve">Implementó servidores y clientes MCP reales sobre Streamable HTTP. El LLM (Groq) tiene temperatura 0, timeout de 20 segundos y un reintento. Las llamadas entre el orquestador y los agentes son HTTP con timeout, sin reintentos ni circuit breaker. No hay RAG: los requisitos de documentación vienen de un diccionario fijo.</w:t>
+        <w:t xml:space="preserve">No existe una integración con servicios reales: los datos de clientes, riesgos y documentación son simulados. Maneja excepciones y tiene un fallback cuando falla el LLM. Menciona conceptos básicos de resiliencia (reintentos, circuit breaker) que no implementó.</w:t>
       </w:r>
     </w:p>
     <w:p>
@@ -4661,7 +4090,7 @@
           <w:sz w:val="20"/>
           <w:szCs w:val="20"/>
         </w:rPr>
-        <w:t xml:space="preserve">Despliegue en cloud (2/6). </w:t>
+        <w:t xml:space="preserve">Despliegue en cloud (3/6). </w:t>
       </w:r>
       <w:r>
         <w:rPr>
@@ -4669,7 +4098,7 @@
           <w:sz w:val="20"/>
           <w:szCs w:val="20"/>
         </w:rPr>
-        <w:t xml:space="preserve">Indicó que la solución está desplegada en una máquina privada a la que accede por SSH. No compartió una URL y el repositorio solo incluye Docker Compose.</w:t>
+        <w:t xml:space="preserve">Indicó que la solución está desplegada en una máquina privada a la que accede por SSH; no compartió una URL. El repositorio incluye Docker Compose.</w:t>
       </w:r>
     </w:p>
     <w:p>
@@ -4685,7 +4114,7 @@
           <w:sz w:val="20"/>
           <w:szCs w:val="20"/>
         </w:rPr>
-        <w:t xml:space="preserve">Calidad del código (2/6). </w:t>
+        <w:t xml:space="preserve">Generación del código (3/6). </w:t>
       </w:r>
       <w:r>
         <w:rPr>
@@ -4693,7 +4122,7 @@
           <w:sz w:val="20"/>
           <w:szCs w:val="20"/>
         </w:rPr>
-        <w:t xml:space="preserve">El código es claro y está bien comentado, y la planificación previa en specs/ es una buena práctica. No hay pruebas automatizadas, solo un script para verificar los servidores MCP.</w:t>
+        <w:t xml:space="preserve">El código generado funciona y supo ubicar dónde estaba cada parte, pero no hay pruebas automatizadas y el repositorio tiene un solo commit.</w:t>
       </w:r>
     </w:p>
     <w:p>
@@ -4711,7 +4140,7 @@
           <w:sz w:val="22"/>
           <w:szCs w:val="22"/>
         </w:rPr>
-        <w:t xml:space="preserve">Defensa: 24 / 40</w:t>
+        <w:t xml:space="preserve">Defensa: 19 / 40</w:t>
       </w:r>
     </w:p>
     <w:p>
@@ -4727,7 +4156,7 @@
           <w:sz w:val="20"/>
           <w:szCs w:val="20"/>
         </w:rPr>
-        <w:t xml:space="preserve">Arquitectura (6/10). </w:t>
+        <w:t xml:space="preserve">Arquitectura (5/10). </w:t>
       </w:r>
       <w:r>
         <w:rPr>
@@ -4735,7 +4164,7 @@
           <w:sz w:val="20"/>
           <w:szCs w:val="20"/>
         </w:rPr>
-        <w:t xml:space="preserve">Explicó el recorrido de la petición y justificó sus decisiones con ejemplos concretos: Kafka para no sumar latencia, MCP como fachada reutilizable de las fuentes de datos, y hexagonal o arquitectura limpia según el tamaño del proyecto. Las capas solo aparecieron al repreguntarle.</w:t>
+        <w:t xml:space="preserve">Explicó el recorrido de la petición, pero no supo explicar su arquitectura ni la división de responsabilidades entre componentes.</w:t>
       </w:r>
     </w:p>
     <w:p>
@@ -4751,7 +4180,7 @@
           <w:sz w:val="20"/>
           <w:szCs w:val="20"/>
         </w:rPr>
-        <w:t xml:space="preserve">Decisiones de código (5/8). </w:t>
+        <w:t xml:space="preserve">Decisiones de código e IA (3/8). </w:t>
       </w:r>
       <w:r>
         <w:rPr>
@@ -4759,7 +4188,7 @@
           <w:sz w:val="20"/>
           <w:szCs w:val="20"/>
         </w:rPr>
-        <w:t xml:space="preserve">Explicó por qué reemplazó A2A por HTTP (problemas de latencia durante la prueba), cómo razona el orquestador frente a los sub-agentes y qué parámetros del LLM ajustaría (temperatura, top_p, top_k). Reconoció que el fallback ante la caída de un sub-agente no está en el código.</w:t>
+        <w:t xml:space="preserve">Mal manejo de prompts. Conoce términos generales de IA (temperatura, top_p, top_k, razonamiento de agentes), pero no sabe cómo implementarlos en conjunto. Explicó que reemplazó A2A por HTTP por problemas de latencia.</w:t>
       </w:r>
     </w:p>
     <w:p>
@@ -4783,7 +4212,7 @@
           <w:sz w:val="20"/>
           <w:szCs w:val="20"/>
         </w:rPr>
-        <w:t xml:space="preserve">Propone Kubernetes (EKS) con autoescalado por demanda (KEDA), un AI gateway para controlar invocaciones y tokens, y servicios de monitoreo como CloudWatch, Dynatrace y LangSmith. No mostró el despliegue.</w:t>
+        <w:t xml:space="preserve">Propuso Kubernetes con autoescalado y un AI gateway, sin detallar cómo lo operaría ni mostrar el despliegue.</w:t>
       </w:r>
     </w:p>
     <w:p>
@@ -4799,7 +4228,7 @@
           <w:sz w:val="20"/>
           <w:szCs w:val="20"/>
         </w:rPr>
-        <w:t xml:space="preserve">Seguridad (5/8). </w:t>
+        <w:t xml:space="preserve">Seguridad (4/8). </w:t>
       </w:r>
       <w:r>
         <w:rPr>
@@ -4807,7 +4236,7 @@
           <w:sz w:val="20"/>
           <w:szCs w:val="20"/>
         </w:rPr>
-        <w:t xml:space="preserve">Propone autenticar en el canal con JWT y propagar la identidad a los agentes, y resolver la autorización (qué usuario accede a qué cliente) en un componente separado del agente, por responsabilidad única. Planteó guardrails en la entrada y salida del orquestador y protección de la base vectorial contra contenido malicioso. Nada de esto está implementado.</w:t>
+        <w:t xml:space="preserve">Propuso autenticar con JWT en el canal y separar la autorización del agente, y aplicar guardrails en la entrada y salida del orquestador. Nada de esto está implementado.</w:t>
       </w:r>
     </w:p>
     <w:p>
@@ -4823,7 +4252,7 @@
           <w:sz w:val="20"/>
           <w:szCs w:val="20"/>
         </w:rPr>
-        <w:t xml:space="preserve">Trade-offs (5/8). </w:t>
+        <w:t xml:space="preserve">Trade-offs (4/8). </w:t>
       </w:r>
       <w:r>
         <w:rPr>
@@ -4831,7 +4260,7 @@
           <w:sz w:val="20"/>
           <w:szCs w:val="20"/>
         </w:rPr>
-        <w:t xml:space="preserve">Para producción propone alinear la arquitectura con los estándares del banco, certificar los agentes con métricas de calidad, pruebas de carga y estrés, y fallback entre modelos mediante el AI gateway. Identifica sus limitaciones, pero sin priorizarlas.</w:t>
+        <w:t xml:space="preserve">Enumeró mejoras para producción (alineación con la arquitectura del banco, pruebas de carga y estrés, fallback entre modelos), pero le falta profundidad en conceptos de resiliencia.</w:t>
       </w:r>
     </w:p>
     <w:p>
@@ -4859,7 +4288,7 @@
           <w:sz w:val="20"/>
           <w:szCs w:val="20"/>
         </w:rPr>
-        <w:t xml:space="preserve">Se recomienda continuar en el proceso. Entregó un flujo funcional con decisiones de diseño acertadas en la capa de agente (reglas de negocio en código, allowlist aplicada fuera del modelo, datos de entrada que no dependen del LLM) e integró MCP de forma real. Conoce bien las herramientas del ecosistema y reconoce con honestidad lo que no implementó.</w:t>
+        <w:t xml:space="preserve">No se recomienda continuar en el proceso. No aprobó la prueba teórica ni la práctica: el diseño no constituye una arquitectura, la estructura del código no es correcta y en la defensa no pudo explicar su arquitectura ni integrar los conceptos de IA que conoce.</w:t>
       </w:r>
     </w:p>
     <w:p>
@@ -4873,12 +4302,11 @@
           <w:sz w:val="20"/>
           <w:szCs w:val="20"/>
         </w:rPr>
-        <w:t xml:space="preserve">Necesita acompañamiento en autenticación y autorización, pruebas automatizadas, resiliencia entre servicios (reintentos, circuit breaker, fallback), persistencia del estado para retomar casos escalados y despliegue verificable. También debe cuidar que el diagrama refleje lo que realmente implementa y justificar la cantidad de servicios frente al tamaño del problema.</w:t>
+        <w:t xml:space="preserve">Para una futura evaluación debería reforzar el diseño de arquitectura por capas y la separación de responsabilidades, la ingeniería de prompts, la implementación real de resiliencia (reintentos, circuit breaker, fallback), la autenticación y autorización, y las pruebas automatizadas.</w:t>
       </w:r>
     </w:p>
     <w:p>
       <w:pPr>
-        <w:pageBreakBefore/>
         <w:rPr>
           <w:rFonts w:ascii="Roboto Slab" w:eastAsia="Roboto Slab" w:hAnsi="Roboto Slab" w:cs="Roboto Slab"/>
           <w:b/>
@@ -4985,7 +4413,7 @@
                 <w:sz w:val="22"/>
                 <w:szCs w:val="22"/>
               </w:rPr>
-              <w:t xml:space="preserve">Buena práctica de planificación (especificación, plan y tareas). El diagrama no coincide con el código en A2A, base vectorial y handoff, y no representa capas, autenticación ni estado.</w:t>
+              <w:t xml:space="preserve">Planifica antes de programar (especificación, plan y tareas), pero el diseño es un flujograma sin capas ni división de responsabilidades. El diagrama no coincide con el código (A2A, base vectorial, handoff).</w:t>
             </w:r>
           </w:p>
         </w:tc>
@@ -5023,7 +4451,7 @@
                 <w:sz w:val="22"/>
                 <w:szCs w:val="22"/>
               </w:rPr>
-              <w:t xml:space="preserve">Sin persistencia del estado, por lo que un caso escalado no puede retomarse. Siete servicios para un caso acotado. Sub-agentes de una sola herramienta que podrían ser llamadas directas.</w:t>
+              <w:t xml:space="preserve">La arquitectura del código no es correcta y no identifica la responsabilidad de cada componente. Sin manejo de estado ni integración con servicios reales. Debe mejorar la ingeniería de prompts.</w:t>
             </w:r>
           </w:p>
         </w:tc>
@@ -5110,7 +4538,7 @@
                 <w:sz w:val="22"/>
                 <w:szCs w:val="22"/>
               </w:rPr>
-              <w:t xml:space="preserve">Docker Compose sin CI/CD ni despliegue verificable (no compartió URL). Sin reintentos ni circuit breaker entre servicios.</w:t>
+              <w:t xml:space="preserve">Despliegue no verificable (sin URL) y sin CI/CD. Resiliencia solo mencionada: sin reintentos ni circuit breaker entre servicios.</w:t>
             </w:r>
           </w:p>
         </w:tc>
@@ -5151,7 +4579,7 @@
                 <w:sz w:val="22"/>
                 <w:szCs w:val="22"/>
               </w:rPr>
-              <w:t xml:space="preserve">Sin autenticación ni autorización en el endpoint (JWT solo mencionado). Sin guardrails implementados. La traza en Kafka incluye nombre y cédula sin enmascarar.</w:t>
+              <w:t xml:space="preserve">Sin autenticación ni autorización (JWT solo mencionado) y sin guardrails implementados. La traza en Kafka incluye nombre y cédula sin enmascarar.</w:t>
             </w:r>
           </w:p>
         </w:tc>

</xml_diff>

<commit_message>
Actualiza informe de Adrián Villacrés con notas sobre 100 y observaciones por pregunta
Co-Authored-By: Claude Opus 5.5 <noreply@anthropic.com>
Claude-Session: https://claude.ai/code/session_01XoDZLsg3S6BNvJBdoo6Rq7
</commit_message>
<xml_diff>
--- a/informes/Informe_entrevista_Adrian_Villacres.docx
+++ b/informes/Informe_entrevista_Adrian_Villacres.docx
@@ -1524,7 +1524,7 @@
                 <w:sz w:val="22"/>
                 <w:szCs w:val="22"/>
               </w:rPr>
-              <w:t xml:space="preserve">NO APROBADO</w:t>
+              <w:t xml:space="preserve">NO APROBADO – 49 / 100</w:t>
             </w:r>
           </w:p>
         </w:tc>
@@ -1900,7 +1900,7 @@
           <w:sz w:val="20"/>
           <w:szCs w:val="20"/>
         </w:rPr>
-        <w:t xml:space="preserve">El candidato no aprobó ninguna de las dos pruebas: obtuvo 12/20 en la teórica y 47/100 en la práctica (diseño 6/20, implementación 22/40, defensa 19/40). Su nota final es 5,04 sobre 10. Logró ejecutar el flujo completo, pero el diseño no constituye una arquitectura, el código no tiene una estructura correcta y en la defensa no pudo explicar su arquitectura ni cómo integrar en conjunto los conceptos de IA que conoce.</w:t>
+        <w:t xml:space="preserve">El candidato no aprobó ninguna de las dos pruebas: obtuvo 60/100 en la teórica y 47/100 en la práctica (diseño 6/20, implementación 22/40, defensa 19/40). Su nota final es 49/100. Logró ejecutar el flujo completo, pero el diseño no constituye una arquitectura, el código no tiene una estructura correcta y en la defensa no pudo explicar su arquitectura ni cómo integrar en conjunto los conceptos de IA que conoce.</w:t>
       </w:r>
     </w:p>
     <w:p>
@@ -1932,7 +1932,7 @@
           <w:sz w:val="20"/>
           <w:szCs w:val="20"/>
         </w:rPr>
-        <w:t xml:space="preserve">Declara 2 años de experiencia en IA y datos en el sector financiero. Maneja la terminología general de IA generativa (agentes, MCP, LangGraph, parámetros de los modelos) y herramientas de observabilidad. Antes de programar escribió una especificación, un plan y una lista de tareas.</w:t>
+        <w:t xml:space="preserve">Declara 2 años de experiencia en IA y datos en el sector financiero. Maneja la terminología general de IA generativa (agentes, MCP, LangGraph, parámetros de los modelos) y de plataforma (AI gateways, Kubernetes con Istio, componentes reutilizables), además de herramientas de observabilidad como LangSmith y Dynatrace. Antes de programar escribió una especificación, un plan y una lista de tareas.</w:t>
       </w:r>
     </w:p>
     <w:p>
@@ -1993,9 +1993,8 @@
         <w:tblLook w:val="04A0" w:firstRow="1" w:lastRow="0" w:firstColumn="1" w:lastColumn="0" w:noHBand="0" w:noVBand="1"/>
       </w:tblPr>
       <w:tblGrid>
-        <w:gridCol w:w="4600"/>
-        <w:gridCol w:w="2200"/>
-        <w:gridCol w:w="2219"/>
+        <w:gridCol w:w="6000"/>
+        <w:gridCol w:w="3019"/>
       </w:tblGrid>
       <w:tr>
         <w:trPr>
@@ -2003,7 +2002,7 @@
         </w:trPr>
         <w:tc>
           <w:tcPr>
-            <w:tcW w:w="4600" w:type="dxa"/>
+            <w:tcW w:w="6000" w:type="dxa"/>
             <w:shd w:val="clear" w:color="auto" w:fill="FFFF00"/>
             <w:vAlign w:val="center"/>
           </w:tcPr>
@@ -2026,30 +2025,7 @@
         </w:tc>
         <w:tc>
           <w:tcPr>
-            <w:tcW w:w="2200" w:type="dxa"/>
-            <w:shd w:val="clear" w:color="auto" w:fill="FFFF00"/>
-            <w:vAlign w:val="center"/>
-          </w:tcPr>
-          <w:p>
-            <w:pPr>
-              <w:spacing w:before="40" w:after="40" w:line="240" w:lineRule="auto"/>
-              <w:jc w:val="left"/>
-            </w:pPr>
-            <w:r>
-              <w:rPr>
-                <w:rFonts w:ascii="Roboto Slab" w:eastAsia="Roboto Slab" w:hAnsi="Roboto Slab" w:cs="Roboto Slab"/>
-                <w:b/>
-                <w:bCs/>
-                <w:sz w:val="19"/>
-                <w:szCs w:val="19"/>
-              </w:rPr>
-              <w:t xml:space="preserve">Puntaje</w:t>
-            </w:r>
-          </w:p>
-        </w:tc>
-        <w:tc>
-          <w:tcPr>
-            <w:tcW w:w="2219" w:type="dxa"/>
+            <w:tcW w:w="3019" w:type="dxa"/>
             <w:shd w:val="clear" w:color="auto" w:fill="FFFF00"/>
             <w:vAlign w:val="center"/>
           </w:tcPr>
@@ -2066,7 +2042,7 @@
                 <w:sz w:val="19"/>
                 <w:szCs w:val="19"/>
               </w:rPr>
-              <w:t xml:space="preserve">Equivalente /10</w:t>
+              <w:t xml:space="preserve">Puntaje</w:t>
             </w:r>
           </w:p>
         </w:tc>
@@ -2077,7 +2053,7 @@
         </w:trPr>
         <w:tc>
           <w:tcPr>
-            <w:tcW w:w="4600" w:type="dxa"/>
+            <w:tcW w:w="6000" w:type="dxa"/>
             <w:vAlign w:val="center"/>
           </w:tcPr>
           <w:p>
@@ -2097,27 +2073,7 @@
         </w:tc>
         <w:tc>
           <w:tcPr>
-            <w:tcW w:w="2200" w:type="dxa"/>
-            <w:vAlign w:val="center"/>
-          </w:tcPr>
-          <w:p>
-            <w:pPr>
-              <w:spacing w:before="40" w:after="40" w:line="240" w:lineRule="auto"/>
-              <w:jc w:val="left"/>
-            </w:pPr>
-            <w:r>
-              <w:rPr>
-                <w:rFonts w:ascii="Roboto Slab" w:eastAsia="Roboto Slab" w:hAnsi="Roboto Slab" w:cs="Roboto Slab"/>
-                <w:sz w:val="19"/>
-                <w:szCs w:val="19"/>
-              </w:rPr>
-              <w:t xml:space="preserve">12 / 20</w:t>
-            </w:r>
-          </w:p>
-        </w:tc>
-        <w:tc>
-          <w:tcPr>
-            <w:tcW w:w="2219" w:type="dxa"/>
+            <w:tcW w:w="3019" w:type="dxa"/>
             <w:vAlign w:val="center"/>
           </w:tcPr>
           <w:p>
@@ -2131,7 +2087,7 @@
                 <w:sz w:val="19"/>
                 <w:szCs w:val="19"/>
               </w:rPr>
-              <w:t xml:space="preserve">6,00</w:t>
+              <w:t xml:space="preserve">60 / 100</w:t>
             </w:r>
           </w:p>
         </w:tc>
@@ -2142,7 +2098,7 @@
         </w:trPr>
         <w:tc>
           <w:tcPr>
-            <w:tcW w:w="4600" w:type="dxa"/>
+            <w:tcW w:w="6000" w:type="dxa"/>
             <w:vAlign w:val="center"/>
           </w:tcPr>
           <w:p>
@@ -2162,27 +2118,7 @@
         </w:tc>
         <w:tc>
           <w:tcPr>
-            <w:tcW w:w="2200" w:type="dxa"/>
-            <w:vAlign w:val="center"/>
-          </w:tcPr>
-          <w:p>
-            <w:pPr>
-              <w:spacing w:before="40" w:after="40" w:line="240" w:lineRule="auto"/>
-              <w:jc w:val="left"/>
-            </w:pPr>
-            <w:r>
-              <w:rPr>
-                <w:rFonts w:ascii="Roboto Slab" w:eastAsia="Roboto Slab" w:hAnsi="Roboto Slab" w:cs="Roboto Slab"/>
-                <w:sz w:val="19"/>
-                <w:szCs w:val="19"/>
-              </w:rPr>
-              <w:t xml:space="preserve">6 / 20</w:t>
-            </w:r>
-          </w:p>
-        </w:tc>
-        <w:tc>
-          <w:tcPr>
-            <w:tcW w:w="2219" w:type="dxa"/>
+            <w:tcW w:w="3019" w:type="dxa"/>
             <w:vAlign w:val="center"/>
           </w:tcPr>
           <w:p>
@@ -2196,7 +2132,7 @@
                 <w:sz w:val="19"/>
                 <w:szCs w:val="19"/>
               </w:rPr>
-              <w:t xml:space="preserve">3,00</w:t>
+              <w:t xml:space="preserve">6 / 20</w:t>
             </w:r>
           </w:p>
         </w:tc>
@@ -2207,7 +2143,7 @@
         </w:trPr>
         <w:tc>
           <w:tcPr>
-            <w:tcW w:w="4600" w:type="dxa"/>
+            <w:tcW w:w="6000" w:type="dxa"/>
             <w:vAlign w:val="center"/>
           </w:tcPr>
           <w:p>
@@ -2227,27 +2163,7 @@
         </w:tc>
         <w:tc>
           <w:tcPr>
-            <w:tcW w:w="2200" w:type="dxa"/>
-            <w:vAlign w:val="center"/>
-          </w:tcPr>
-          <w:p>
-            <w:pPr>
-              <w:spacing w:before="40" w:after="40" w:line="240" w:lineRule="auto"/>
-              <w:jc w:val="left"/>
-            </w:pPr>
-            <w:r>
-              <w:rPr>
-                <w:rFonts w:ascii="Roboto Slab" w:eastAsia="Roboto Slab" w:hAnsi="Roboto Slab" w:cs="Roboto Slab"/>
-                <w:sz w:val="19"/>
-                <w:szCs w:val="19"/>
-              </w:rPr>
-              <w:t xml:space="preserve">22 / 40</w:t>
-            </w:r>
-          </w:p>
-        </w:tc>
-        <w:tc>
-          <w:tcPr>
-            <w:tcW w:w="2219" w:type="dxa"/>
+            <w:tcW w:w="3019" w:type="dxa"/>
             <w:vAlign w:val="center"/>
           </w:tcPr>
           <w:p>
@@ -2261,7 +2177,7 @@
                 <w:sz w:val="19"/>
                 <w:szCs w:val="19"/>
               </w:rPr>
-              <w:t xml:space="preserve">5,50</w:t>
+              <w:t xml:space="preserve">22 / 40</w:t>
             </w:r>
           </w:p>
         </w:tc>
@@ -2272,7 +2188,7 @@
         </w:trPr>
         <w:tc>
           <w:tcPr>
-            <w:tcW w:w="4600" w:type="dxa"/>
+            <w:tcW w:w="6000" w:type="dxa"/>
             <w:vAlign w:val="center"/>
           </w:tcPr>
           <w:p>
@@ -2292,27 +2208,7 @@
         </w:tc>
         <w:tc>
           <w:tcPr>
-            <w:tcW w:w="2200" w:type="dxa"/>
-            <w:vAlign w:val="center"/>
-          </w:tcPr>
-          <w:p>
-            <w:pPr>
-              <w:spacing w:before="40" w:after="40" w:line="240" w:lineRule="auto"/>
-              <w:jc w:val="left"/>
-            </w:pPr>
-            <w:r>
-              <w:rPr>
-                <w:rFonts w:ascii="Roboto Slab" w:eastAsia="Roboto Slab" w:hAnsi="Roboto Slab" w:cs="Roboto Slab"/>
-                <w:sz w:val="19"/>
-                <w:szCs w:val="19"/>
-              </w:rPr>
-              <w:t xml:space="preserve">19 / 40</w:t>
-            </w:r>
-          </w:p>
-        </w:tc>
-        <w:tc>
-          <w:tcPr>
-            <w:tcW w:w="2219" w:type="dxa"/>
+            <w:tcW w:w="3019" w:type="dxa"/>
             <w:vAlign w:val="center"/>
           </w:tcPr>
           <w:p>
@@ -2326,7 +2222,7 @@
                 <w:sz w:val="19"/>
                 <w:szCs w:val="19"/>
               </w:rPr>
-              <w:t xml:space="preserve">4,75</w:t>
+              <w:t xml:space="preserve">19 / 40</w:t>
             </w:r>
           </w:p>
         </w:tc>
@@ -2337,7 +2233,7 @@
         </w:trPr>
         <w:tc>
           <w:tcPr>
-            <w:tcW w:w="4600" w:type="dxa"/>
+            <w:tcW w:w="6000" w:type="dxa"/>
             <w:shd w:val="clear" w:color="auto" w:fill="F2F2F2"/>
             <w:vAlign w:val="center"/>
           </w:tcPr>
@@ -2360,30 +2256,7 @@
         </w:tc>
         <w:tc>
           <w:tcPr>
-            <w:tcW w:w="2200" w:type="dxa"/>
-            <w:shd w:val="clear" w:color="auto" w:fill="F2F2F2"/>
-            <w:vAlign w:val="center"/>
-          </w:tcPr>
-          <w:p>
-            <w:pPr>
-              <w:spacing w:before="40" w:after="40" w:line="240" w:lineRule="auto"/>
-              <w:jc w:val="left"/>
-            </w:pPr>
-            <w:r>
-              <w:rPr>
-                <w:rFonts w:ascii="Roboto Slab" w:eastAsia="Roboto Slab" w:hAnsi="Roboto Slab" w:cs="Roboto Slab"/>
-                <w:b/>
-                <w:bCs/>
-                <w:sz w:val="19"/>
-                <w:szCs w:val="19"/>
-              </w:rPr>
-              <w:t xml:space="preserve">47 / 100</w:t>
-            </w:r>
-          </w:p>
-        </w:tc>
-        <w:tc>
-          <w:tcPr>
-            <w:tcW w:w="2219" w:type="dxa"/>
+            <w:tcW w:w="3019" w:type="dxa"/>
             <w:shd w:val="clear" w:color="auto" w:fill="F2F2F2"/>
             <w:vAlign w:val="center"/>
           </w:tcPr>
@@ -2400,7 +2273,7 @@
                 <w:sz w:val="19"/>
                 <w:szCs w:val="19"/>
               </w:rPr>
-              <w:t xml:space="preserve">4,88</w:t>
+              <w:t xml:space="preserve">47 / 100</w:t>
             </w:r>
           </w:p>
         </w:tc>
@@ -2411,7 +2284,7 @@
         </w:trPr>
         <w:tc>
           <w:tcPr>
-            <w:tcW w:w="4600" w:type="dxa"/>
+            <w:tcW w:w="6000" w:type="dxa"/>
             <w:shd w:val="clear" w:color="auto" w:fill="F2F2F2"/>
             <w:vAlign w:val="center"/>
           </w:tcPr>
@@ -2428,36 +2301,13 @@
                 <w:sz w:val="19"/>
                 <w:szCs w:val="19"/>
               </w:rPr>
-              <w:t xml:space="preserve">Nota final (teórica + práctica)</w:t>
-            </w:r>
-          </w:p>
-        </w:tc>
-        <w:tc>
-          <w:tcPr>
-            <w:tcW w:w="2200" w:type="dxa"/>
-            <w:shd w:val="clear" w:color="auto" w:fill="F2F2F2"/>
-            <w:vAlign w:val="center"/>
-          </w:tcPr>
-          <w:p>
-            <w:pPr>
-              <w:spacing w:before="40" w:after="40" w:line="240" w:lineRule="auto"/>
-              <w:jc w:val="left"/>
-            </w:pPr>
-            <w:r>
-              <w:rPr>
-                <w:rFonts w:ascii="Roboto Slab" w:eastAsia="Roboto Slab" w:hAnsi="Roboto Slab" w:cs="Roboto Slab"/>
-                <w:b/>
-                <w:bCs/>
-                <w:sz w:val="19"/>
-                <w:szCs w:val="19"/>
-              </w:rPr>
-              <w:t xml:space="preserve">—</w:t>
-            </w:r>
-          </w:p>
-        </w:tc>
-        <w:tc>
-          <w:tcPr>
-            <w:tcW w:w="2219" w:type="dxa"/>
+              <w:t xml:space="preserve">Nota final (15 % teórica + 85 % práctica)</w:t>
+            </w:r>
+          </w:p>
+        </w:tc>
+        <w:tc>
+          <w:tcPr>
+            <w:tcW w:w="3019" w:type="dxa"/>
             <w:shd w:val="clear" w:color="auto" w:fill="F2F2F2"/>
             <w:vAlign w:val="center"/>
           </w:tcPr>
@@ -2474,7 +2324,7 @@
                 <w:sz w:val="19"/>
                 <w:szCs w:val="19"/>
               </w:rPr>
-              <w:t xml:space="preserve">5,04</w:t>
+              <w:t xml:space="preserve">49 / 100</w:t>
             </w:r>
           </w:p>
         </w:tc>
@@ -3818,7 +3668,7 @@
           <w:sz w:val="22"/>
           <w:szCs w:val="22"/>
         </w:rPr>
-        <w:t xml:space="preserve">Evaluación teórica: 12 / 20 (reprobada)</w:t>
+        <w:t xml:space="preserve">Evaluación teórica: 60 / 100 (reprobada)</w:t>
       </w:r>
     </w:p>
     <w:p>
@@ -3888,7 +3738,7 @@
           <w:sz w:val="20"/>
           <w:szCs w:val="20"/>
         </w:rPr>
-        <w:t xml:space="preserve">El diseño no presenta capas ni división de responsabilidades. Solo al repreguntarle mencionó qué capas usaría (canal, dominio, datos, y observabilidad y seguridad transversales), pero no forman parte del diseño.</w:t>
+        <w:t xml:space="preserve">El diseño no presenta capas ni división de responsabilidades. Conoce el concepto: al repreguntarle mencionó qué capas usaría (canal, dominio, datos, y observabilidad y seguridad transversales), pero no las implementó. Para validar entradas habló de AI gateways e Istio, sin llevarlo al diseño.</w:t>
       </w:r>
     </w:p>
     <w:p>
@@ -3912,7 +3762,7 @@
           <w:sz w:val="20"/>
           <w:szCs w:val="20"/>
         </w:rPr>
-        <w:t xml:space="preserve">El flujo nombra los agentes y fuentes de datos que pide el caso, pero no muestra autenticación, manejo del estado ni cómo vuelve la respuesta del asesor al proceso.</w:t>
+        <w:t xml:space="preserve">El flujo nombra los agentes y fuentes de datos que pide el caso. Identificó como requisito de seguridad que cada agente acceda solo a las herramientas autorizadas, pero el diseño se acopla a un chat y no muestra autenticación, manejo del estado ni cómo vuelve la respuesta del asesor al proceso.</w:t>
       </w:r>
     </w:p>
     <w:p>
@@ -4188,7 +4038,7 @@
           <w:sz w:val="20"/>
           <w:szCs w:val="20"/>
         </w:rPr>
-        <w:t xml:space="preserve">Mal manejo de prompts. Conoce términos generales de IA (temperatura, top_p, top_k, razonamiento de agentes), pero no sabe cómo implementarlos en conjunto. Explicó que reemplazó A2A por HTTP por problemas de latencia.</w:t>
+        <w:t xml:space="preserve">Mal manejo de prompts. Configuró parámetros del modelo (temperatura, razonamiento) y conoce términos generales de IA (top_p, top_k, razonamiento de agentes), pero no sabe cómo implementarlos en conjunto. Explicó que reemplazó A2A por HTTP por problemas de latencia.</w:t>
       </w:r>
     </w:p>
     <w:p>
@@ -4260,7 +4110,7 @@
           <w:sz w:val="20"/>
           <w:szCs w:val="20"/>
         </w:rPr>
-        <w:t xml:space="preserve">Enumeró mejoras para producción (alineación con la arquitectura del banco, pruebas de carga y estrés, fallback entre modelos), pero le falta profundidad en conceptos de resiliencia.</w:t>
+        <w:t xml:space="preserve">Enumeró mejoras para producción (alineación con la arquitectura del banco, pruebas de carga y estrés, fallback entre modelos). Ante un incidente propuso observabilidad con LangSmith, Dynatrace y servicios de AWS, y medir la latencia de las peticiones, sin contención ni evaluaciones de regresión. Le falta profundidad en conceptos de resiliencia.</w:t>
       </w:r>
     </w:p>
     <w:p>

</xml_diff>